<commit_message>
Eleva currículo com projetos de tecnologia e experiências detalhadas
Incorpora dados das anotações pessoais: nova seção Projetos de Tecnologia
(CBA-EXAUST e Sistema LIS), atuação real na CBA (Docnix, ServiceNow,
Power BI/ObraSoft, inventário com SAP, melhoria de processos) e detalhes
da operação logística na CEFRI (WMS Blue Yonder, câmaras frias -25°C).
Mantém especificação visual e 2 páginas exatas.

Co-Authored-By: Claude Fable 5 <noreply@anthropic.com>
Claude-Session: https://claude.ai/code/session_019HdFRyXgvzwcnxRxeQH7i9
</commit_message>
<xml_diff>
--- a/Curriculo_Jeferson_dos_Santos_Cardoso.docx
+++ b/Curriculo_Jeferson_dos_Santos_Cardoso.docx
@@ -52,7 +52,7 @@
     </w:p>
     <w:p>
       <w:pPr>
-        <w:spacing w:lineRule="auto" w:line="276" w:before="200" w:after="100"/>
+        <w:spacing w:lineRule="auto" w:line="276" w:before="160" w:after="100"/>
         <w:jc w:val="left"/>
         <w:pBdr>
           <w:bottom w:val="single" w:sz="6" w:space="2" w:color="1B365D"/>
@@ -82,7 +82,7 @@
           <w:color w:val="333333"/>
           <w:sz w:val="22"/>
         </w:rPr>
-        <w:t>Profissional com dupla formação técnica pelo SENAI — Eletromecânica (1.500h) e Administração (1.200h) — e experiência prática em logística e operações industriais, em transição estratégica para a área de Tecnologia da Informação. Histórico comprovado de crescimento acelerado: promovido de Operador de Armazém Júnior a Pleno em menos de 12 meses. Aprovado no curso de Tecnólogo em Análise e Desenvolvimento de Sistemas (Facens), com domínio de Excel Avançado e Power BI e fundamentos de Python e lógica de programação. Perfil analítico e disciplinado, que une a visão operacional do chão de fábrica à capacidade de transformar dados em soluções.</w:t>
+        <w:t>Profissional com dupla formação técnica pelo SENAI — Eletromecânica (1.500h) e Administração (1.200h) — em transição estratégica para Tecnologia da Informação, aprovado no Tecnólogo em Análise e Desenvolvimento de Sistemas (Facens). Na CBA, atuei no Suporte de Operações da Sala de Fornos 7 com governança documental (Docnix), monitoramento de indicadores em Power BI, suporte de TI (ServiceNow) e melhoria contínua — e desenvolvi, por iniciativa própria, um sistema web de gestão de ocorrências integrado a Power Automate e Excel Online, colocado em produção no setor. Antes, fui promovido de Operador de Armazém Júnior a Pleno em menos de 12 meses. Perfil analítico e autodidata, que transforma controles manuais em soluções digitais.</w:t>
       </w:r>
     </w:p>
     <w:p>
@@ -143,7 +143,7 @@
           <w:color w:val="333333"/>
           <w:sz w:val="22"/>
         </w:rPr>
-        <w:t>Aprendiz – Administração Industrial</w:t>
+        <w:t>Aprendiz – Suporte de Operações (Sala de Fornos 7 – ADM)</w:t>
       </w:r>
       <w:r>
         <w:rPr>
@@ -181,7 +181,7 @@
           <w:color w:val="333333"/>
           <w:sz w:val="22"/>
         </w:rPr>
-        <w:t>Selecionado para o programa Jovem Aprendiz da CBA, uma das maiores produtoras de alumínio do país, com jornada dupla: prática administrativa na empresa pela manhã e formação Técnica em Administração no SENAI à tarde, de segunda a sexta.</w:t>
+        <w:t>Governança documental no sistema Docnix: pesquisa avançada, verificação de vigência e distribuição de Procedimentos Operacionais, Padrões de Trabalho e FMEAs, com apoio à integração de novos funcionários.</w:t>
       </w:r>
     </w:p>
     <w:p>
@@ -209,7 +209,7 @@
           <w:color w:val="333333"/>
           <w:sz w:val="22"/>
         </w:rPr>
-        <w:t>Apoio às rotinas administrativas do setor: organização e controle de documentos, atualização de planilhas e elaboração de relatórios em Excel para suporte à gestão.</w:t>
+        <w:t>Key User local de TI: chamados no ServiceNow, recuperação de computadores bloqueados por BitLocker e suporte a impressoras e acessos corporativos.</w:t>
       </w:r>
     </w:p>
     <w:p>
@@ -237,7 +237,63 @@
           <w:color w:val="333333"/>
           <w:sz w:val="22"/>
         </w:rPr>
-        <w:t>Conclusão simultânea do contrato de aprendizagem e do diploma técnico (1.200h).</w:t>
+        <w:t>Monitoramento diário de indicadores de segurança (DDS e abrangências) em Power BI e ObraSoft/Power Apps, com geração de relatórios e baixa de pendências.</w:t>
+      </w:r>
+    </w:p>
+    <w:p>
+      <w:pPr>
+        <w:spacing w:lineRule="auto" w:line="276" w:before="0" w:after="40"/>
+        <w:ind w:left="283" w:hanging="283"/>
+        <w:jc w:val="left"/>
+      </w:pPr>
+      <w:r>
+        <w:rPr>
+          <w:rFonts w:ascii="Arial" w:hAnsi="Arial" w:cs="Arial"/>
+          <w:b w:val="0"/>
+          <w:i w:val="0"/>
+          <w:color w:val="333333"/>
+          <w:sz w:val="22"/>
+        </w:rPr>
+        <w:t>•</w:t>
+        <w:tab/>
+      </w:r>
+      <w:r>
+        <w:rPr>
+          <w:rFonts w:ascii="Arial" w:hAnsi="Arial" w:cs="Arial"/>
+          <w:b w:val="0"/>
+          <w:i w:val="0"/>
+          <w:color w:val="333333"/>
+          <w:sz w:val="22"/>
+        </w:rPr>
+        <w:t>Inventário completo do almoxarifado do setor, com planilhas de controle de entrada e saída em Excel, consultas de saldo no SAP e gestão da distribuição de EPIs.</w:t>
+      </w:r>
+    </w:p>
+    <w:p>
+      <w:pPr>
+        <w:spacing w:lineRule="auto" w:line="276" w:before="0" w:after="40"/>
+        <w:ind w:left="283" w:hanging="283"/>
+        <w:jc w:val="left"/>
+      </w:pPr>
+      <w:r>
+        <w:rPr>
+          <w:rFonts w:ascii="Arial" w:hAnsi="Arial" w:cs="Arial"/>
+          <w:b w:val="0"/>
+          <w:i w:val="0"/>
+          <w:color w:val="333333"/>
+          <w:sz w:val="22"/>
+        </w:rPr>
+        <w:t>•</w:t>
+        <w:tab/>
+      </w:r>
+      <w:r>
+        <w:rPr>
+          <w:rFonts w:ascii="Arial" w:hAnsi="Arial" w:cs="Arial"/>
+          <w:b w:val="0"/>
+          <w:i w:val="0"/>
+          <w:color w:val="333333"/>
+          <w:sz w:val="22"/>
+        </w:rPr>
+        <w:t>Melhoria de processo por iniciativa própria: substituição de anotações em lousa por cadernos de checklist padronizados, criando histórico auditável para auditorias.</w:t>
       </w:r>
     </w:p>
     <w:p>
@@ -345,7 +401,7 @@
           <w:color w:val="333333"/>
           <w:sz w:val="22"/>
         </w:rPr>
-        <w:t>Operação certificada de empilhadeira (NR-11, com reciclagens periódicas) na movimentação de cargas em ambiente frigorificado de alto giro.</w:t>
+        <w:t>Operação de empilhadeiras (NR-11) e separação de cargas em câmaras frias a -25 °C com coletor de dados e WMS Blue Yonder (picking por LPN e conferência de estoque), além de expedição e carregamento de veículos em turno noturno de alto giro.</w:t>
       </w:r>
     </w:p>
     <w:p>
@@ -373,35 +429,7 @@
           <w:color w:val="333333"/>
           <w:sz w:val="22"/>
         </w:rPr>
-        <w:t>Atuação em recebimento, conferência, endereçamento, separação (picking) e expedição de mercadorias, com foco em acuracidade de estoque e cumprimento rigoroso de prazos.</w:t>
-      </w:r>
-    </w:p>
-    <w:p>
-      <w:pPr>
-        <w:spacing w:lineRule="auto" w:line="276" w:before="0" w:after="40"/>
-        <w:ind w:left="283" w:hanging="283"/>
-        <w:jc w:val="left"/>
-      </w:pPr>
-      <w:r>
-        <w:rPr>
-          <w:rFonts w:ascii="Arial" w:hAnsi="Arial" w:cs="Arial"/>
-          <w:b w:val="0"/>
-          <w:i w:val="0"/>
-          <w:color w:val="333333"/>
-          <w:sz w:val="22"/>
-        </w:rPr>
-        <w:t>•</w:t>
-        <w:tab/>
-      </w:r>
-      <w:r>
-        <w:rPr>
-          <w:rFonts w:ascii="Arial" w:hAnsi="Arial" w:cs="Arial"/>
-          <w:b w:val="0"/>
-          <w:i w:val="0"/>
-          <w:color w:val="333333"/>
-          <w:sz w:val="22"/>
-        </w:rPr>
-        <w:t>Capacitação contínua em paralelo ao trabalho em turno: PCP (40h), Metrologia (60h), Excel Avançado (40h), Power BI (32h) e Python (30h).</w:t>
+        <w:t>Capacitação contínua em paralelo ao turno: PCP (40h), Metrologia (60h), Excel Avançado (40h), Power BI (32h) e Python (30h).</w:t>
       </w:r>
     </w:p>
     <w:p>
@@ -417,7 +445,7 @@
           <w:color w:val="333333"/>
           <w:sz w:val="22"/>
         </w:rPr>
-        <w:t>Supermercado São Roque</w:t>
+        <w:t>Supermercado São Roque – Centro de Distribuição</w:t>
       </w:r>
       <w:r>
         <w:rPr>
@@ -481,12 +509,31 @@
           <w:color w:val="333333"/>
           <w:sz w:val="22"/>
         </w:rPr>
-        <w:t>Recebimento, conferência, organização de estoque e reposição de mercadorias, garantindo o abastecimento contínuo da área de vendas, com atendimento ao cliente e trabalho em equipe em operação de ritmo intenso.</w:t>
+        <w:t>Carregamento de caminhões em docas, paletização com filme stretch, organização do centro de distribuição e controle de devolução de ativos (caixas) a fornecedores.</w:t>
       </w:r>
     </w:p>
     <w:p>
       <w:pPr>
-        <w:spacing w:lineRule="auto" w:line="276" w:before="120" w:after="20"/>
+        <w:spacing w:lineRule="auto" w:line="276" w:before="180" w:after="100"/>
+        <w:jc w:val="left"/>
+        <w:pBdr>
+          <w:bottom w:val="single" w:sz="6" w:space="2" w:color="1B365D"/>
+        </w:pBdr>
+      </w:pPr>
+      <w:r>
+        <w:rPr>
+          <w:rFonts w:ascii="Arial" w:hAnsi="Arial" w:cs="Arial"/>
+          <w:b/>
+          <w:i w:val="0"/>
+          <w:color w:val="1B365D"/>
+          <w:sz w:val="28"/>
+        </w:rPr>
+        <w:t>PROJETOS DE TECNOLOGIA</w:t>
+      </w:r>
+    </w:p>
+    <w:p>
+      <w:pPr>
+        <w:spacing w:lineRule="auto" w:line="276" w:before="40" w:after="20"/>
         <w:jc w:val="left"/>
       </w:pPr>
       <w:r>
@@ -497,43 +544,7 @@
           <w:color w:val="333333"/>
           <w:sz w:val="22"/>
         </w:rPr>
-        <w:t>AMP GRU Sustentável</w:t>
-      </w:r>
-      <w:r>
-        <w:rPr>
-          <w:rFonts w:ascii="Arial" w:hAnsi="Arial" w:cs="Arial"/>
-          <w:b w:val="0"/>
-          <w:i w:val="0"/>
-          <w:color w:val="333333"/>
-          <w:sz w:val="22"/>
-        </w:rPr>
-        <w:t xml:space="preserve"> — São Roque/SP</w:t>
-      </w:r>
-    </w:p>
-    <w:p>
-      <w:pPr>
-        <w:spacing w:lineRule="auto" w:line="276" w:before="0" w:after="40"/>
-        <w:jc w:val="left"/>
-      </w:pPr>
-      <w:r>
-        <w:rPr>
-          <w:rFonts w:ascii="Arial" w:hAnsi="Arial" w:cs="Arial"/>
-          <w:b/>
-          <w:i w:val="0"/>
-          <w:color w:val="333333"/>
-          <w:sz w:val="22"/>
-        </w:rPr>
-        <w:t>Jardineiro</w:t>
-      </w:r>
-      <w:r>
-        <w:rPr>
-          <w:rFonts w:ascii="Arial" w:hAnsi="Arial" w:cs="Arial"/>
-          <w:b w:val="0"/>
-          <w:i/>
-          <w:color w:val="333333"/>
-          <w:sz w:val="22"/>
-        </w:rPr>
-        <w:t xml:space="preserve">  |  out/2020 – jan/2021</w:t>
+        <w:t>CBA-EXAUST – Sistema de Gestão de Ocorrências de Fornos (autoral)</w:t>
       </w:r>
     </w:p>
     <w:p>
@@ -561,7 +572,79 @@
           <w:color w:val="333333"/>
           <w:sz w:val="22"/>
         </w:rPr>
-        <w:t>Primeira experiência com carteira assinada, aos 18 anos, em conservação de áreas verdes — base da ética de trabalho e do senso de responsabilidade.</w:t>
+        <w:t>Aplicação web (PWA) criada por iniciativa própria e colocada em produção para registrar e analisar ocorrências de exaustão dos fornos da Sala de Fornos 7: dashboards com Pareto, ranking de fornos críticos, alertas, modo TV e resumo executivo.</w:t>
+      </w:r>
+    </w:p>
+    <w:p>
+      <w:pPr>
+        <w:spacing w:lineRule="auto" w:line="276" w:before="0" w:after="80"/>
+        <w:ind w:left="283" w:hanging="283"/>
+        <w:jc w:val="left"/>
+      </w:pPr>
+      <w:r>
+        <w:rPr>
+          <w:rFonts w:ascii="Arial" w:hAnsi="Arial" w:cs="Arial"/>
+          <w:b w:val="0"/>
+          <w:i w:val="0"/>
+          <w:color w:val="333333"/>
+          <w:sz w:val="22"/>
+        </w:rPr>
+        <w:t>•</w:t>
+        <w:tab/>
+      </w:r>
+      <w:r>
+        <w:rPr>
+          <w:rFonts w:ascii="Arial" w:hAnsi="Arial" w:cs="Arial"/>
+          <w:b w:val="0"/>
+          <w:i w:val="0"/>
+          <w:color w:val="333333"/>
+          <w:sz w:val="22"/>
+        </w:rPr>
+        <w:t>Integração com Power Automate e Excel Online/OneDrive, exportação CSV/Excel e relatório mensal automático por e-mail; publicação via GitHub e Cloudflare.</w:t>
+      </w:r>
+    </w:p>
+    <w:p>
+      <w:pPr>
+        <w:spacing w:lineRule="auto" w:line="276" w:before="0" w:after="20"/>
+        <w:jc w:val="left"/>
+      </w:pPr>
+      <w:r>
+        <w:rPr>
+          <w:rFonts w:ascii="Arial" w:hAnsi="Arial" w:cs="Arial"/>
+          <w:b/>
+          <w:i w:val="0"/>
+          <w:color w:val="333333"/>
+          <w:sz w:val="22"/>
+        </w:rPr>
+        <w:t>Sistema de Gestão de Estoque LIS (projeto SENAI)</w:t>
+      </w:r>
+    </w:p>
+    <w:p>
+      <w:pPr>
+        <w:spacing w:lineRule="auto" w:line="276" w:before="0" w:after="60"/>
+        <w:ind w:left="283" w:hanging="283"/>
+        <w:jc w:val="left"/>
+      </w:pPr>
+      <w:r>
+        <w:rPr>
+          <w:rFonts w:ascii="Arial" w:hAnsi="Arial" w:cs="Arial"/>
+          <w:b w:val="0"/>
+          <w:i w:val="0"/>
+          <w:color w:val="333333"/>
+          <w:sz w:val="22"/>
+        </w:rPr>
+        <w:t>•</w:t>
+        <w:tab/>
+      </w:r>
+      <w:r>
+        <w:rPr>
+          <w:rFonts w:ascii="Arial" w:hAnsi="Arial" w:cs="Arial"/>
+          <w:b w:val="0"/>
+          <w:i w:val="0"/>
+          <w:color w:val="333333"/>
+          <w:sz w:val="22"/>
+        </w:rPr>
+        <w:t>Site em HTML/JavaScript publicado no GitHub Pages e integrado ao Excel Online via Power Automate: lançamentos de entrada e saída em tempo real, curva ABC, estoque de segurança, ponto de pedido e dashboards automáticos.</w:t>
       </w:r>
     </w:p>
     <w:p>
@@ -585,7 +668,7 @@
     </w:p>
     <w:p>
       <w:pPr>
-        <w:spacing w:lineRule="auto" w:line="276" w:before="40" w:after="20"/>
+        <w:spacing w:lineRule="auto" w:line="276" w:before="40" w:after="40"/>
         <w:jc w:val="left"/>
       </w:pPr>
       <w:r>
@@ -606,28 +689,12 @@
           <w:color w:val="333333"/>
           <w:sz w:val="22"/>
         </w:rPr>
-        <w:t xml:space="preserve"> — Facens, Sorocaba/SP</w:t>
+        <w:t xml:space="preserve"> — Facens, Sorocaba/SP. Aprovado; início em agosto/2026.</w:t>
       </w:r>
     </w:p>
     <w:p>
       <w:pPr>
-        <w:spacing w:lineRule="auto" w:line="276" w:before="0" w:after="120"/>
-        <w:jc w:val="left"/>
-      </w:pPr>
-      <w:r>
-        <w:rPr>
-          <w:rFonts w:ascii="Arial" w:hAnsi="Arial" w:cs="Arial"/>
-          <w:b w:val="0"/>
-          <w:i w:val="0"/>
-          <w:color w:val="333333"/>
-          <w:sz w:val="22"/>
-        </w:rPr>
-        <w:t>Aprovado em processo seletivo; início previsto para agosto/2026.</w:t>
-      </w:r>
-    </w:p>
-    <w:p>
-      <w:pPr>
-        <w:spacing w:lineRule="auto" w:line="276" w:before="0" w:after="20"/>
+        <w:spacing w:lineRule="auto" w:line="276" w:before="0" w:after="40"/>
         <w:jc w:val="left"/>
       </w:pPr>
       <w:r>
@@ -648,28 +715,12 @@
           <w:color w:val="333333"/>
           <w:sz w:val="22"/>
         </w:rPr>
-        <w:t xml:space="preserve"> — SENAI “Antônio Ermírio de Moraes” (1.200h)</w:t>
+        <w:t xml:space="preserve"> — SENAI (1.200h). Diploma em junho/2026 — Aprendiz CBA.</w:t>
       </w:r>
     </w:p>
     <w:p>
       <w:pPr>
-        <w:spacing w:lineRule="auto" w:line="276" w:before="0" w:after="120"/>
-        <w:jc w:val="left"/>
-      </w:pPr>
-      <w:r>
-        <w:rPr>
-          <w:rFonts w:ascii="Arial" w:hAnsi="Arial" w:cs="Arial"/>
-          <w:b w:val="0"/>
-          <w:i w:val="0"/>
-          <w:color w:val="333333"/>
-          <w:sz w:val="22"/>
-        </w:rPr>
-        <w:t>Concluído em junho/2026, com diploma — cursado pelo programa Aprendiz CBA.</w:t>
-      </w:r>
-    </w:p>
-    <w:p>
-      <w:pPr>
-        <w:spacing w:lineRule="auto" w:line="276" w:before="0" w:after="20"/>
+        <w:spacing w:lineRule="auto" w:line="276" w:before="0" w:after="60"/>
         <w:jc w:val="left"/>
       </w:pPr>
       <w:r>
@@ -690,23 +741,7 @@
           <w:color w:val="333333"/>
           <w:sz w:val="22"/>
         </w:rPr>
-        <w:t xml:space="preserve"> — SENAI Centro de Treinamento Mairinque (1.500h)</w:t>
-      </w:r>
-    </w:p>
-    <w:p>
-      <w:pPr>
-        <w:spacing w:lineRule="auto" w:line="276" w:before="0" w:after="80"/>
-        <w:jc w:val="left"/>
-      </w:pPr>
-      <w:r>
-        <w:rPr>
-          <w:rFonts w:ascii="Arial" w:hAnsi="Arial" w:cs="Arial"/>
-          <w:b w:val="0"/>
-          <w:i w:val="0"/>
-          <w:color w:val="333333"/>
-          <w:sz w:val="22"/>
-        </w:rPr>
-        <w:t>Concluído em junho/2025, com diploma.</w:t>
+        <w:t xml:space="preserve"> — SENAI Mairinque (1.500h). Diploma em junho/2025.</w:t>
       </w:r>
     </w:p>
     <w:p>
@@ -726,22 +761,6 @@
           <w:sz w:val="28"/>
         </w:rPr>
         <w:t>CURSOS E CERTIFICAÇÕES</w:t>
-      </w:r>
-    </w:p>
-    <w:p>
-      <w:pPr>
-        <w:spacing w:lineRule="auto" w:line="276" w:before="40" w:after="60"/>
-        <w:jc w:val="left"/>
-      </w:pPr>
-      <w:r>
-        <w:rPr>
-          <w:rFonts w:ascii="Arial" w:hAnsi="Arial" w:cs="Arial"/>
-          <w:b/>
-          <w:i w:val="0"/>
-          <w:color w:val="333333"/>
-          <w:sz w:val="22"/>
-        </w:rPr>
-        <w:t>Tecnologia e Dados</w:t>
       </w:r>
     </w:p>
     <w:p>
@@ -769,7 +788,7 @@
           <w:color w:val="333333"/>
           <w:sz w:val="22"/>
         </w:rPr>
-        <w:t>Excel Avançado – SENAI (40h, 2024) e Excel Básico – SENAI (20h, 2025)</w:t>
+        <w:t>Excel Avançado (40h), Power BI (32h) e Fundamentos do Python (30h) – SENAI (2024)</w:t>
       </w:r>
     </w:p>
     <w:p>
@@ -797,7 +816,7 @@
           <w:color w:val="333333"/>
           <w:sz w:val="22"/>
         </w:rPr>
-        <w:t>Microsoft Power BI – SENAI (32h, 2024)</w:t>
+        <w:t>Lógica de Programação (14h), Segurança Cibernética (4h) e Desvendando a Indústria 4.0 (20h) – SENAI (2025)</w:t>
       </w:r>
     </w:p>
     <w:p>
@@ -825,7 +844,7 @@
           <w:color w:val="333333"/>
           <w:sz w:val="22"/>
         </w:rPr>
-        <w:t>Fundamentos do Python 1 (30h, 2024) e Lógica de Programação (14h, 2025) – SENAI</w:t>
+        <w:t>Fundamentos da Inteligência Artificial (8h) e Ética na Inteligência Artificial (4h) – SENAI (2025)</w:t>
       </w:r>
     </w:p>
     <w:p>
@@ -853,79 +872,7 @@
           <w:color w:val="333333"/>
           <w:sz w:val="22"/>
         </w:rPr>
-        <w:t>Por Dentro da Segurança Cibernética (4h) e Desvendando a Indústria 4.0 (20h) – SENAI (2025)</w:t>
-      </w:r>
-    </w:p>
-    <w:p>
-      <w:pPr>
-        <w:spacing w:lineRule="auto" w:line="276" w:before="0" w:after="100"/>
-        <w:ind w:left="283" w:hanging="283"/>
-        <w:jc w:val="left"/>
-      </w:pPr>
-      <w:r>
-        <w:rPr>
-          <w:rFonts w:ascii="Arial" w:hAnsi="Arial" w:cs="Arial"/>
-          <w:b w:val="0"/>
-          <w:i w:val="0"/>
-          <w:color w:val="333333"/>
-          <w:sz w:val="22"/>
-        </w:rPr>
-        <w:t>•</w:t>
-        <w:tab/>
-      </w:r>
-      <w:r>
-        <w:rPr>
-          <w:rFonts w:ascii="Arial" w:hAnsi="Arial" w:cs="Arial"/>
-          <w:b w:val="0"/>
-          <w:i w:val="0"/>
-          <w:color w:val="333333"/>
-          <w:sz w:val="22"/>
-        </w:rPr>
-        <w:t>Fundamentos da Inteligência Artificial (8h) e Ética na Inteligência Artificial (4h) – SENAI (2025)</w:t>
-      </w:r>
-    </w:p>
-    <w:p>
-      <w:pPr>
-        <w:spacing w:lineRule="auto" w:line="276" w:before="0" w:after="60"/>
-        <w:jc w:val="left"/>
-      </w:pPr>
-      <w:r>
-        <w:rPr>
-          <w:rFonts w:ascii="Arial" w:hAnsi="Arial" w:cs="Arial"/>
-          <w:b/>
-          <w:i w:val="0"/>
-          <w:color w:val="333333"/>
-          <w:sz w:val="22"/>
-        </w:rPr>
-        <w:t>Industrial e Logística</w:t>
-      </w:r>
-    </w:p>
-    <w:p>
-      <w:pPr>
-        <w:spacing w:lineRule="auto" w:line="276" w:before="0" w:after="40"/>
-        <w:ind w:left="283" w:hanging="283"/>
-        <w:jc w:val="left"/>
-      </w:pPr>
-      <w:r>
-        <w:rPr>
-          <w:rFonts w:ascii="Arial" w:hAnsi="Arial" w:cs="Arial"/>
-          <w:b w:val="0"/>
-          <w:i w:val="0"/>
-          <w:color w:val="333333"/>
-          <w:sz w:val="22"/>
-        </w:rPr>
-        <w:t>•</w:t>
-        <w:tab/>
-      </w:r>
-      <w:r>
-        <w:rPr>
-          <w:rFonts w:ascii="Arial" w:hAnsi="Arial" w:cs="Arial"/>
-          <w:b w:val="0"/>
-          <w:i w:val="0"/>
-          <w:color w:val="333333"/>
-          <w:sz w:val="22"/>
-        </w:rPr>
-        <w:t>Caldeiraria Prática – Construtor de Equipamentos Industriais – AHCX Treinamentos / MJS Brasil (jan–jul/2026, em fase final de conclusão)</w:t>
+        <w:t>Caldeiraria Prática – AHCX Treinamentos / MJS Brasil (jan–jul/2026, em conclusão)</w:t>
       </w:r>
     </w:p>
     <w:p>
@@ -981,12 +928,12 @@
           <w:color w:val="333333"/>
           <w:sz w:val="22"/>
         </w:rPr>
-        <w:t>Metrologia Aplicada à Mecânica – SENAI (60h, 2024)</w:t>
+        <w:t>Metrologia Aplicada à Mecânica (60h) e PCP (40h) – SENAI (2024)</w:t>
       </w:r>
     </w:p>
     <w:p>
       <w:pPr>
-        <w:spacing w:lineRule="auto" w:line="276" w:before="0" w:after="40"/>
+        <w:spacing w:lineRule="auto" w:line="276" w:before="0" w:after="60"/>
         <w:ind w:left="283" w:hanging="283"/>
         <w:jc w:val="left"/>
       </w:pPr>
@@ -1009,79 +956,7 @@
           <w:color w:val="333333"/>
           <w:sz w:val="22"/>
         </w:rPr>
-        <w:t>Planejamento e Controle da Produção – SENAI (40h, 2024)</w:t>
-      </w:r>
-    </w:p>
-    <w:p>
-      <w:pPr>
-        <w:spacing w:lineRule="auto" w:line="276" w:before="0" w:after="100"/>
-        <w:ind w:left="283" w:hanging="283"/>
-        <w:jc w:val="left"/>
-      </w:pPr>
-      <w:r>
-        <w:rPr>
-          <w:rFonts w:ascii="Arial" w:hAnsi="Arial" w:cs="Arial"/>
-          <w:b w:val="0"/>
-          <w:i w:val="0"/>
-          <w:color w:val="333333"/>
-          <w:sz w:val="22"/>
-        </w:rPr>
-        <w:t>•</w:t>
-        <w:tab/>
-      </w:r>
-      <w:r>
-        <w:rPr>
-          <w:rFonts w:ascii="Arial" w:hAnsi="Arial" w:cs="Arial"/>
-          <w:b w:val="0"/>
-          <w:i w:val="0"/>
-          <w:color w:val="333333"/>
-          <w:sz w:val="22"/>
-        </w:rPr>
-        <w:t>Segurança no Trabalho (14h, 2023) e Consumo Consciente de Energia (14h, 2025) – SENAI</w:t>
-      </w:r>
-    </w:p>
-    <w:p>
-      <w:pPr>
-        <w:spacing w:lineRule="auto" w:line="276" w:before="0" w:after="60"/>
-        <w:jc w:val="left"/>
-      </w:pPr>
-      <w:r>
-        <w:rPr>
-          <w:rFonts w:ascii="Arial" w:hAnsi="Arial" w:cs="Arial"/>
-          <w:b/>
-          <w:i w:val="0"/>
-          <w:color w:val="333333"/>
-          <w:sz w:val="22"/>
-        </w:rPr>
-        <w:t>Gestão</w:t>
-      </w:r>
-    </w:p>
-    <w:p>
-      <w:pPr>
-        <w:spacing w:lineRule="auto" w:line="276" w:before="0" w:after="80"/>
-        <w:ind w:left="283" w:hanging="283"/>
-        <w:jc w:val="left"/>
-      </w:pPr>
-      <w:r>
-        <w:rPr>
-          <w:rFonts w:ascii="Arial" w:hAnsi="Arial" w:cs="Arial"/>
-          <w:b w:val="0"/>
-          <w:i w:val="0"/>
-          <w:color w:val="333333"/>
-          <w:sz w:val="22"/>
-        </w:rPr>
-        <w:t>•</w:t>
-        <w:tab/>
-      </w:r>
-      <w:r>
-        <w:rPr>
-          <w:rFonts w:ascii="Arial" w:hAnsi="Arial" w:cs="Arial"/>
-          <w:b w:val="0"/>
-          <w:i w:val="0"/>
-          <w:color w:val="333333"/>
-          <w:sz w:val="22"/>
-        </w:rPr>
-        <w:t>Administração – Nova NETT (96h, 2024)</w:t>
+        <w:t>Administração – Nova NETT (96h, 2024); Segurança no Trabalho – SENAI (14h, 2023)</w:t>
       </w:r>
     </w:p>
     <w:p>
@@ -1128,7 +1003,7 @@
           <w:color w:val="333333"/>
           <w:sz w:val="22"/>
         </w:rPr>
-        <w:t xml:space="preserve">Análise de dados: </w:t>
+        <w:t xml:space="preserve">Dados e BI: </w:t>
       </w:r>
       <w:r>
         <w:rPr>
@@ -1138,7 +1013,7 @@
           <w:color w:val="333333"/>
           <w:sz w:val="22"/>
         </w:rPr>
-        <w:t>Excel Avançado (dashboards, fórmulas, relatórios gerenciais) e Power BI</w:t>
+        <w:t>Excel Avançado (dashboards, tabelas dinâmicas, KPIs), Power BI e Microsoft Forms</w:t>
       </w:r>
     </w:p>
     <w:p>
@@ -1166,7 +1041,7 @@
           <w:color w:val="333333"/>
           <w:sz w:val="22"/>
         </w:rPr>
-        <w:t xml:space="preserve">Programação: </w:t>
+        <w:t xml:space="preserve">Automação e desenvolvimento: </w:t>
       </w:r>
       <w:r>
         <w:rPr>
@@ -1176,7 +1051,7 @@
           <w:color w:val="333333"/>
           <w:sz w:val="22"/>
         </w:rPr>
-        <w:t>fundamentos de Python e lógica de programação</w:t>
+        <w:t>Power Automate, Power Apps, HTML/JavaScript, GitHub, fundamentos de Python e lógica de programação</w:t>
       </w:r>
     </w:p>
     <w:p>
@@ -1204,7 +1079,7 @@
           <w:color w:val="333333"/>
           <w:sz w:val="22"/>
         </w:rPr>
-        <w:t xml:space="preserve">Logística de armazém: </w:t>
+        <w:t xml:space="preserve">Sistemas corporativos: </w:t>
       </w:r>
       <w:r>
         <w:rPr>
@@ -1214,7 +1089,7 @@
           <w:color w:val="333333"/>
           <w:sz w:val="22"/>
         </w:rPr>
-        <w:t>recebimento, endereçamento, picking, expedição, inventário e operação de empilhadeira (NR-11)</w:t>
+        <w:t>SAP (consultas), ServiceNow, Docnix e WMS Blue Yonder</w:t>
       </w:r>
     </w:p>
     <w:p>
@@ -1242,7 +1117,7 @@
           <w:color w:val="333333"/>
           <w:sz w:val="22"/>
         </w:rPr>
-        <w:t xml:space="preserve">Indústria: </w:t>
+        <w:t xml:space="preserve">Melhoria contínua: </w:t>
       </w:r>
       <w:r>
         <w:rPr>
@@ -1252,7 +1127,7 @@
           <w:color w:val="333333"/>
           <w:sz w:val="22"/>
         </w:rPr>
-        <w:t>eletromecânica, metrologia, caldeiraria, planejamento e controle da produção (PCP) e segurança do trabalho</w:t>
+        <w:t>5S, PDCA, Matriz GUT, gestão visual e noções de Scrum</w:t>
       </w:r>
     </w:p>
     <w:p>
@@ -1280,7 +1155,7 @@
           <w:color w:val="333333"/>
           <w:sz w:val="22"/>
         </w:rPr>
-        <w:t xml:space="preserve">Gestão: </w:t>
+        <w:t xml:space="preserve">Logística e indústria: </w:t>
       </w:r>
       <w:r>
         <w:rPr>
@@ -1290,12 +1165,12 @@
           <w:color w:val="333333"/>
           <w:sz w:val="22"/>
         </w:rPr>
-        <w:t>rotinas administrativas, organização de documentos e apoio a relatórios gerenciais</w:t>
+        <w:t>operação de empilhadeira (NR-11), inventários, PCP e metrologia</w:t>
       </w:r>
     </w:p>
     <w:p>
       <w:pPr>
-        <w:spacing w:lineRule="auto" w:line="276" w:before="0" w:after="80"/>
+        <w:spacing w:lineRule="auto" w:line="276" w:before="0" w:after="60"/>
         <w:ind w:left="283" w:hanging="283"/>
         <w:jc w:val="left"/>
       </w:pPr>
@@ -1328,7 +1203,7 @@
           <w:color w:val="333333"/>
           <w:sz w:val="22"/>
         </w:rPr>
-        <w:t>disciplina, resiliência, aprendizado rápido e foco em resolução de problemas</w:t>
+        <w:t>disciplina, autodidatismo, resiliência e foco em resolução de problemas</w:t>
       </w:r>
     </w:p>
     <w:p>
@@ -1348,34 +1223,6 @@
           <w:sz w:val="28"/>
         </w:rPr>
         <w:t>INFORMAÇÕES ADICIONAIS</w:t>
-      </w:r>
-    </w:p>
-    <w:p>
-      <w:pPr>
-        <w:spacing w:lineRule="auto" w:line="276" w:before="0" w:after="40"/>
-        <w:ind w:left="283" w:hanging="283"/>
-        <w:jc w:val="left"/>
-      </w:pPr>
-      <w:r>
-        <w:rPr>
-          <w:rFonts w:ascii="Arial" w:hAnsi="Arial" w:cs="Arial"/>
-          <w:b w:val="0"/>
-          <w:i w:val="0"/>
-          <w:color w:val="333333"/>
-          <w:sz w:val="22"/>
-        </w:rPr>
-        <w:t>•</w:t>
-        <w:tab/>
-      </w:r>
-      <w:r>
-        <w:rPr>
-          <w:rFonts w:ascii="Arial" w:hAnsi="Arial" w:cs="Arial"/>
-          <w:b w:val="0"/>
-          <w:i w:val="0"/>
-          <w:color w:val="333333"/>
-          <w:sz w:val="22"/>
-        </w:rPr>
-        <w:t>CNH categorias A e B, com observação EAR (Exerce Atividade Remunerada)</w:t>
       </w:r>
     </w:p>
     <w:p>
@@ -1403,7 +1250,7 @@
           <w:color w:val="333333"/>
           <w:sz w:val="22"/>
         </w:rPr>
-        <w:t>Disponibilidade para início imediato e para trabalho em turnos</w:t>
+        <w:t>CNH categorias A e B (EAR); disponibilidade para início imediato e para trabalho em turnos</w:t>
       </w:r>
     </w:p>
     <w:sectPr>

</xml_diff>

<commit_message>
Ajusta projetos para descrição honesta (piloto, sem marca da empresa)
O sistema de ocorrências foi descontinuado pela TI da empresa e as contas
corporativas/acadêmicas foram encerradas. Remove o nome CBA-EXAUST e a
alegação de produção ativa, descrevendo os projetos como piloto/projeto
acadêmico — fiel ao que aconteceu e defensável em entrevista.

Co-Authored-By: Claude Fable 5 <noreply@anthropic.com>
Claude-Session: https://claude.ai/code/session_019HdFRyXgvzwcnxRxeQH7i9
</commit_message>
<xml_diff>
--- a/Curriculo_Jeferson_dos_Santos_Cardoso.docx
+++ b/Curriculo_Jeferson_dos_Santos_Cardoso.docx
@@ -82,7 +82,7 @@
           <w:color w:val="333333"/>
           <w:sz w:val="22"/>
         </w:rPr>
-        <w:t>Profissional com dupla formação técnica pelo SENAI — Eletromecânica (1.500h) e Administração (1.200h) — em transição estratégica para Tecnologia da Informação, aprovado no Tecnólogo em Análise e Desenvolvimento de Sistemas (Facens). Na CBA, atuei no Suporte de Operações da Sala de Fornos 7 com governança documental (Docnix), monitoramento de indicadores em Power BI, suporte de TI (ServiceNow) e melhoria contínua — e desenvolvi, por iniciativa própria, um sistema web de gestão de ocorrências integrado a Power Automate e Excel Online, colocado em produção no setor. Antes, fui promovido de Operador de Armazém Júnior a Pleno em menos de 12 meses. Perfil analítico e autodidata, que transforma controles manuais em soluções digitais.</w:t>
+        <w:t>Profissional com dupla formação técnica pelo SENAI — Eletromecânica (1.500h) e Administração (1.200h) — em transição estratégica para Tecnologia da Informação, aprovado no Tecnólogo em Análise e Desenvolvimento de Sistemas (Facens). Na CBA, atuei no Suporte de Operações da Sala de Fornos 7 com governança documental (Docnix), monitoramento de indicadores em Power BI, suporte de TI (ServiceNow) e melhoria contínua — e desenvolvi, por iniciativa própria, um sistema web de gestão de ocorrências integrado a Power Automate e Excel Online, testado em piloto no setor. Antes, fui promovido de Operador de Armazém Júnior a Pleno em menos de 12 meses. Perfil analítico e autodidata, que transforma controles manuais em soluções digitais.</w:t>
       </w:r>
     </w:p>
     <w:p>
@@ -544,7 +544,7 @@
           <w:color w:val="333333"/>
           <w:sz w:val="22"/>
         </w:rPr>
-        <w:t>CBA-EXAUST – Sistema de Gestão de Ocorrências de Fornos (autoral)</w:t>
+        <w:t>Sistema de Gestão de Ocorrências de Fornos Industriais (projeto autoral)</w:t>
       </w:r>
     </w:p>
     <w:p>
@@ -572,7 +572,7 @@
           <w:color w:val="333333"/>
           <w:sz w:val="22"/>
         </w:rPr>
-        <w:t>Aplicação web (PWA) criada por iniciativa própria e colocada em produção para registrar e analisar ocorrências de exaustão dos fornos da Sala de Fornos 7: dashboards com Pareto, ranking de fornos críticos, alertas, modo TV e resumo executivo.</w:t>
+        <w:t>Aplicação web (PWA) criada por iniciativa própria e testada em caráter piloto na rotina da Sala de Fornos 7 para registrar e analisar ocorrências de exaustão: dashboards com Pareto, ranking de fornos críticos, alertas, modo TV e resumo executivo.</w:t>
       </w:r>
     </w:p>
     <w:p>
@@ -616,7 +616,7 @@
           <w:color w:val="333333"/>
           <w:sz w:val="22"/>
         </w:rPr>
-        <w:t>Sistema de Gestão de Estoque LIS (projeto SENAI)</w:t>
+        <w:t>Sistema de Gestão de Estoque LIS (projeto acadêmico – SENAI)</w:t>
       </w:r>
     </w:p>
     <w:p>
@@ -644,7 +644,7 @@
           <w:color w:val="333333"/>
           <w:sz w:val="22"/>
         </w:rPr>
-        <w:t>Site em HTML/JavaScript publicado no GitHub Pages e integrado ao Excel Online via Power Automate: lançamentos de entrada e saída em tempo real, curva ABC, estoque de segurança, ponto de pedido e dashboards automáticos.</w:t>
+        <w:t>Site em HTML/JavaScript hospedado no GitHub Pages e integrado ao Excel Online via Power Automate: lançamentos de entrada e saída em tempo real, curva ABC, estoque de segurança, ponto de pedido e dashboards automáticos.</w:t>
       </w:r>
     </w:p>
     <w:p>

</xml_diff>

<commit_message>
Adiciona kit de candidatura: currículo maduro + roteiro de entrevista + plano de estudos
Currículo: resumo e projetos reescritos com narrativa problema→solução→
resultado, incluindo desenvolvimento assistido por IA como competência.
Novos documentos na mesma identidade visual: Roteiro_de_Entrevista (pitch
pessoal, STAR do projeto principal, respostas prontas e glossário) e
Plano_de_Estudos (8 semanas até o início da Facens, com entregas de
portfólio por semana).

Co-Authored-By: Claude Fable 5 <noreply@anthropic.com>
Claude-Session: https://claude.ai/code/session_019HdFRyXgvzwcnxRxeQH7i9
</commit_message>
<xml_diff>
--- a/Curriculo_Jeferson_dos_Santos_Cardoso.docx
+++ b/Curriculo_Jeferson_dos_Santos_Cardoso.docx
@@ -82,7 +82,7 @@
           <w:color w:val="333333"/>
           <w:sz w:val="22"/>
         </w:rPr>
-        <w:t>Profissional com dupla formação técnica pelo SENAI — Eletromecânica (1.500h) e Administração (1.200h) — em transição estratégica para Tecnologia da Informação, aprovado no Tecnólogo em Análise e Desenvolvimento de Sistemas (Facens). Na CBA, atuei no Suporte de Operações da Sala de Fornos 7 com governança documental (Docnix), monitoramento de indicadores em Power BI, suporte de TI (ServiceNow) e melhoria contínua — e desenvolvi, por iniciativa própria, um sistema web de gestão de ocorrências integrado a Power Automate e Excel Online, testado em piloto no setor. Antes, fui promovido de Operador de Armazém Júnior a Pleno em menos de 12 meses. Perfil analítico e autodidata, que transforma controles manuais em soluções digitais.</w:t>
+        <w:t>Profissional em transição para Tecnologia da Informação, com dupla formação técnica pelo SENAI — Eletromecânica (1.500h) e Administração (1.200h) — e aprovado no Tecnólogo em Análise e Desenvolvimento de Sistemas (Facens). Minha marca é identificar dores reais da operação e transformá-las em soluções digitais: na CBA, atuei no Suporte de Operações da Sala de Fornos 7 (governança documental no Docnix, indicadores em Power BI, suporte de TI via ServiceNow) e criei, por iniciativa própria, um sistema web de gestão de ocorrências testado em piloto no setor, desenvolvido com apoio de IA e iteração contínua. Promovido de Operador de Armazém Júnior a Pleno em menos de 12 meses na experiência anterior. Disciplina construída em jornada dupla de trabalho e estudo, com foco em resultado mensurável.</w:t>
       </w:r>
     </w:p>
     <w:p>
@@ -572,7 +572,7 @@
           <w:color w:val="333333"/>
           <w:sz w:val="22"/>
         </w:rPr>
-        <w:t>Aplicação web (PWA) criada por iniciativa própria e testada em caráter piloto na rotina da Sala de Fornos 7 para registrar e analisar ocorrências de exaustão: dashboards com Pareto, ranking de fornos críticos, alertas, modo TV e resumo executivo.</w:t>
+        <w:t>Identifiquei uma dor real da operação — controles de ocorrências de exaustão em lousa, sem histórico nem análise — e criei uma aplicação web (PWA) testada em piloto na Sala de Fornos 7: dashboards com Pareto, ranking de fornos críticos, alertas automáticos, modo TV e resumo executivo.</w:t>
       </w:r>
     </w:p>
     <w:p>
@@ -600,7 +600,7 @@
           <w:color w:val="333333"/>
           <w:sz w:val="22"/>
         </w:rPr>
-        <w:t>Integração com Power Automate e Excel Online/OneDrive, exportação CSV/Excel e relatório mensal automático por e-mail; publicação via GitHub e Cloudflare.</w:t>
+        <w:t>Ciclo completo do projeto: levantamento de requisitos com a operação, desenvolvimento iterativo com apoio de IA, integração com Power Automate e Excel Online/OneDrive, relatório mensal automático por e-mail e publicação via GitHub e Cloudflare.</w:t>
       </w:r>
     </w:p>
     <w:p>
@@ -1051,7 +1051,7 @@
           <w:color w:val="333333"/>
           <w:sz w:val="22"/>
         </w:rPr>
-        <w:t>Power Automate, Power Apps, HTML/JavaScript, GitHub, fundamentos de Python e lógica de programação</w:t>
+        <w:t>Power Automate, Power Apps, HTML/JavaScript, GitHub, fundamentos de Python e desenvolvimento assistido por IA (especificação, revisão e iteração de código)</w:t>
       </w:r>
     </w:p>
     <w:p>

</xml_diff>

<commit_message>
Aplica feedback 8.7→9+: resumo direto, projetos com resultado, GitHub no cabeçalho
Resumo reescrito de forma mais direta e poderosa; projeto principal
estruturado em dor/responsabilidades/resultado com menção às IAs usadas;
bullet de melhoria de processos na CBA conectado ao projeto principal;
link github.com/j3ff-11 no cabeçalho; bullets encurtados e títulos de
seção com keep-with-next para evitar título órfão no fim de página.

Co-Authored-By: Claude Fable 5 <noreply@anthropic.com>
Claude-Session: https://claude.ai/code/session_019HdFRyXgvzwcnxRxeQH7i9
</commit_message>
<xml_diff>
--- a/Curriculo_Jeferson_dos_Santos_Cardoso.docx
+++ b/Curriculo_Jeferson_dos_Santos_Cardoso.docx
@@ -47,11 +47,12 @@
           <w:color w:val="333333"/>
           <w:sz w:val="22"/>
         </w:rPr>
-        <w:t>linkedin.com/in/jeferson-santos35  |  CNH: A/B (EAR)</w:t>
+        <w:t>linkedin.com/in/jeferson-santos35  |  github.com/j3ff-11  |  CNH: A/B (EAR)</w:t>
       </w:r>
     </w:p>
     <w:p>
       <w:pPr>
+        <w:keepNext/>
         <w:spacing w:lineRule="auto" w:line="276" w:before="160" w:after="100"/>
         <w:jc w:val="left"/>
         <w:pBdr>
@@ -82,12 +83,13 @@
           <w:color w:val="333333"/>
           <w:sz w:val="22"/>
         </w:rPr>
-        <w:t>Profissional em transição para Tecnologia da Informação, com dupla formação técnica pelo SENAI — Eletromecânica (1.500h) e Administração (1.200h) — e aprovado no Tecnólogo em Análise e Desenvolvimento de Sistemas (Facens). Minha marca é identificar dores reais da operação e transformá-las em soluções digitais: na CBA, atuei no Suporte de Operações da Sala de Fornos 7 (governança documental no Docnix, indicadores em Power BI, suporte de TI via ServiceNow) e criei, por iniciativa própria, um sistema web de gestão de ocorrências testado em piloto no setor, desenvolvido com apoio de IA e iteração contínua. Promovido de Operador de Armazém Júnior a Pleno em menos de 12 meses na experiência anterior. Disciplina construída em jornada dupla de trabalho e estudo, com foco em resultado mensurável.</w:t>
+        <w:t>Profissional em transição para Tecnologia da Informação, com dupla formação técnica pelo SENAI (Eletromecânica e Administração) e aprovado no Tecnólogo em Análise e Desenvolvimento de Sistemas (Facens). Destaco-me pela capacidade de identificar problemas reais da operação e convertê-los em soluções digitais práticas: na CBA, desenvolvi um sistema web (PWA) de gestão de ocorrências testado em piloto na Sala de Fornos 7, integrado a Power Automate e Excel Online. Experiência em suporte de TI (ServiceNow), Power BI e governança documental (Docnix). Promovido de Operador Júnior a Pleno em menos de 12 meses na experiência anterior. Disciplinado e autodidata, com aprendizado acelerado por projetos práticos e uso intensivo de IA.</w:t>
       </w:r>
     </w:p>
     <w:p>
       <w:pPr>
-        <w:spacing w:lineRule="auto" w:line="276" w:before="180" w:after="100"/>
+        <w:keepNext/>
+        <w:spacing w:lineRule="auto" w:line="276" w:before="160" w:after="100"/>
         <w:jc w:val="left"/>
         <w:pBdr>
           <w:bottom w:val="single" w:sz="6" w:space="2" w:color="1B365D"/>
@@ -181,7 +183,7 @@
           <w:color w:val="333333"/>
           <w:sz w:val="22"/>
         </w:rPr>
-        <w:t>Governança documental no sistema Docnix: pesquisa avançada, verificação de vigência e distribuição de Procedimentos Operacionais, Padrões de Trabalho e FMEAs, com apoio à integração de novos funcionários.</w:t>
+        <w:t>Governança documental no Docnix: pesquisa avançada, verificação de vigência e distribuição de Procedimentos Operacionais, Padrões de Trabalho e FMEAs.</w:t>
       </w:r>
     </w:p>
     <w:p>
@@ -293,7 +295,7 @@
           <w:color w:val="333333"/>
           <w:sz w:val="22"/>
         </w:rPr>
-        <w:t>Melhoria de processo por iniciativa própria: substituição de anotações em lousa por cadernos de checklist padronizados, criando histórico auditável para auditorias.</w:t>
+        <w:t>Melhoria de processos: substituí anotações em lousa por checklists padronizados com histórico auditável — iniciativa que evoluiu para o sistema web descrito em Projetos de Tecnologia.</w:t>
       </w:r>
     </w:p>
     <w:p>
@@ -401,7 +403,7 @@
           <w:color w:val="333333"/>
           <w:sz w:val="22"/>
         </w:rPr>
-        <w:t>Operação de empilhadeiras (NR-11) e separação de cargas em câmaras frias a -25 °C com coletor de dados e WMS Blue Yonder (picking por LPN e conferência de estoque), além de expedição e carregamento de veículos em turno noturno de alto giro.</w:t>
+        <w:t>Operação de empilhadeiras (NR-11) e separação de cargas em câmaras frias a -25 °C com coletor de dados e WMS Blue Yonder, além de expedição e carregamento de veículos em turno noturno de alto giro.</w:t>
       </w:r>
     </w:p>
     <w:p>
@@ -514,7 +516,8 @@
     </w:p>
     <w:p>
       <w:pPr>
-        <w:spacing w:lineRule="auto" w:line="276" w:before="180" w:after="100"/>
+        <w:keepNext/>
+        <w:spacing w:lineRule="auto" w:line="276" w:before="160" w:after="100"/>
         <w:jc w:val="left"/>
         <w:pBdr>
           <w:bottom w:val="single" w:sz="6" w:space="2" w:color="1B365D"/>
@@ -572,7 +575,45 @@
           <w:color w:val="333333"/>
           <w:sz w:val="22"/>
         </w:rPr>
-        <w:t>Identifiquei uma dor real da operação — controles de ocorrências de exaustão em lousa, sem histórico nem análise — e criei uma aplicação web (PWA) testada em piloto na Sala de Fornos 7: dashboards com Pareto, ranking de fornos críticos, alertas automáticos, modo TV e resumo executivo.</w:t>
+        <w:t>Dor crítica identificada: controles manuais em lousa, sem histórico nem análise. Desenvolvi e testei em piloto uma aplicação web (PWA) com dashboards (Pareto, ranking de fornos críticos), alertas automáticos, modo TV e resumo executivo.</w:t>
+      </w:r>
+    </w:p>
+    <w:p>
+      <w:pPr>
+        <w:spacing w:lineRule="auto" w:line="276" w:before="0" w:after="40"/>
+        <w:ind w:left="283" w:hanging="283"/>
+        <w:jc w:val="left"/>
+      </w:pPr>
+      <w:r>
+        <w:rPr>
+          <w:rFonts w:ascii="Arial" w:hAnsi="Arial" w:cs="Arial"/>
+          <w:b w:val="0"/>
+          <w:i w:val="0"/>
+          <w:color w:val="333333"/>
+          <w:sz w:val="22"/>
+        </w:rPr>
+        <w:t>•</w:t>
+        <w:tab/>
+      </w:r>
+      <w:r>
+        <w:rPr>
+          <w:rFonts w:ascii="Arial" w:hAnsi="Arial" w:cs="Arial"/>
+          <w:b/>
+          <w:i w:val="0"/>
+          <w:color w:val="333333"/>
+          <w:sz w:val="22"/>
+        </w:rPr>
+        <w:t xml:space="preserve">Responsabilidades: </w:t>
+      </w:r>
+      <w:r>
+        <w:rPr>
+          <w:rFonts w:ascii="Arial" w:hAnsi="Arial" w:cs="Arial"/>
+          <w:b w:val="0"/>
+          <w:i w:val="0"/>
+          <w:color w:val="333333"/>
+          <w:sz w:val="22"/>
+        </w:rPr>
+        <w:t>levantamento de requisitos com a equipe, desenvolvimento iterativo com apoio de IA (Claude, Copilot), integração Power Automate + Excel Online, relatórios automáticos por e-mail e deploy via GitHub + Cloudflare.</w:t>
       </w:r>
     </w:p>
     <w:p>
@@ -595,12 +636,22 @@
       <w:r>
         <w:rPr>
           <w:rFonts w:ascii="Arial" w:hAnsi="Arial" w:cs="Arial"/>
+          <w:b/>
+          <w:i w:val="0"/>
+          <w:color w:val="333333"/>
+          <w:sz w:val="22"/>
+        </w:rPr>
+        <w:t xml:space="preserve">Resultado: </w:t>
+      </w:r>
+      <w:r>
+        <w:rPr>
+          <w:rFonts w:ascii="Arial" w:hAnsi="Arial" w:cs="Arial"/>
           <w:b w:val="0"/>
           <w:i w:val="0"/>
           <w:color w:val="333333"/>
           <w:sz w:val="22"/>
         </w:rPr>
-        <w:t>Ciclo completo do projeto: levantamento de requisitos com a operação, desenvolvimento iterativo com apoio de IA, integração com Power Automate e Excel Online/OneDrive, relatório mensal automático por e-mail e publicação via GitHub e Cloudflare.</w:t>
+        <w:t>registros manuais substituídos por um sistema digital auditável e visual, facilitando a priorização dos fornos críticos e a tomada de decisão.</w:t>
       </w:r>
     </w:p>
     <w:p>
@@ -649,7 +700,8 @@
     </w:p>
     <w:p>
       <w:pPr>
-        <w:spacing w:lineRule="auto" w:line="276" w:before="180" w:after="100"/>
+        <w:keepNext/>
+        <w:spacing w:lineRule="auto" w:line="276" w:before="160" w:after="100"/>
         <w:jc w:val="left"/>
         <w:pBdr>
           <w:bottom w:val="single" w:sz="6" w:space="2" w:color="1B365D"/>
@@ -746,7 +798,8 @@
     </w:p>
     <w:p>
       <w:pPr>
-        <w:spacing w:lineRule="auto" w:line="276" w:before="180" w:after="100"/>
+        <w:keepNext/>
+        <w:spacing w:lineRule="auto" w:line="276" w:before="160" w:after="100"/>
         <w:jc w:val="left"/>
         <w:pBdr>
           <w:bottom w:val="single" w:sz="6" w:space="2" w:color="1B365D"/>
@@ -905,7 +958,7 @@
     </w:p>
     <w:p>
       <w:pPr>
-        <w:spacing w:lineRule="auto" w:line="276" w:before="0" w:after="40"/>
+        <w:spacing w:lineRule="auto" w:line="276" w:before="0" w:after="60"/>
         <w:ind w:left="283" w:hanging="283"/>
         <w:jc w:val="left"/>
       </w:pPr>
@@ -933,35 +986,8 @@
     </w:p>
     <w:p>
       <w:pPr>
-        <w:spacing w:lineRule="auto" w:line="276" w:before="0" w:after="60"/>
-        <w:ind w:left="283" w:hanging="283"/>
-        <w:jc w:val="left"/>
-      </w:pPr>
-      <w:r>
-        <w:rPr>
-          <w:rFonts w:ascii="Arial" w:hAnsi="Arial" w:cs="Arial"/>
-          <w:b w:val="0"/>
-          <w:i w:val="0"/>
-          <w:color w:val="333333"/>
-          <w:sz w:val="22"/>
-        </w:rPr>
-        <w:t>•</w:t>
-        <w:tab/>
-      </w:r>
-      <w:r>
-        <w:rPr>
-          <w:rFonts w:ascii="Arial" w:hAnsi="Arial" w:cs="Arial"/>
-          <w:b w:val="0"/>
-          <w:i w:val="0"/>
-          <w:color w:val="333333"/>
-          <w:sz w:val="22"/>
-        </w:rPr>
-        <w:t>Administração – Nova NETT (96h, 2024); Segurança no Trabalho – SENAI (14h, 2023)</w:t>
-      </w:r>
-    </w:p>
-    <w:p>
-      <w:pPr>
-        <w:spacing w:lineRule="auto" w:line="276" w:before="180" w:after="100"/>
+        <w:keepNext/>
+        <w:spacing w:lineRule="auto" w:line="276" w:before="160" w:after="100"/>
         <w:jc w:val="left"/>
         <w:pBdr>
           <w:bottom w:val="single" w:sz="6" w:space="2" w:color="1B365D"/>
@@ -1208,7 +1234,8 @@
     </w:p>
     <w:p>
       <w:pPr>
-        <w:spacing w:lineRule="auto" w:line="276" w:before="180" w:after="100"/>
+        <w:keepNext/>
+        <w:spacing w:lineRule="auto" w:line="276" w:before="160" w:after="100"/>
         <w:jc w:val="left"/>
         <w:pBdr>
           <w:bottom w:val="single" w:sz="6" w:space="2" w:color="1B365D"/>

</xml_diff>

<commit_message>
Aplica versão final de texto definida pelo usuário
Conteúdo integral fornecido pelo usuário: tagline no cabeçalho, resumo em
três parágrafos, experiências ampliadas, projetos detalhados, cursos em
lista individual e competências agrupadas por categoria. Espaçamento
compactado para fechar em 3 páginas mantendo a especificação visual.

Co-Authored-By: Claude Fable 5 <noreply@anthropic.com>
Claude-Session: https://claude.ai/code/session_019HdFRyXgvzwcnxRxeQH7i9
</commit_message>
<xml_diff>
--- a/Curriculo_Jeferson_dos_Santos_Cardoso.docx
+++ b/Curriculo_Jeferson_dos_Santos_Cardoso.docx
@@ -36,7 +36,7 @@
     </w:p>
     <w:p>
       <w:pPr>
-        <w:spacing w:lineRule="auto" w:line="276" w:before="0" w:after="40"/>
+        <w:spacing w:lineRule="auto" w:line="276" w:before="0" w:after="20"/>
         <w:jc w:val="left"/>
       </w:pPr>
       <w:r>
@@ -52,8 +52,24 @@
     </w:p>
     <w:p>
       <w:pPr>
+        <w:spacing w:lineRule="auto" w:line="276" w:before="0" w:after="40"/>
+        <w:jc w:val="left"/>
+      </w:pPr>
+      <w:r>
+        <w:rPr>
+          <w:rFonts w:ascii="Arial" w:hAnsi="Arial" w:cs="Arial"/>
+          <w:b/>
+          <w:i w:val="0"/>
+          <w:color w:val="333333"/>
+          <w:sz w:val="22"/>
+        </w:rPr>
+        <w:t>Suporte de Operações | Administração | BI | Tecnologia | Logística</w:t>
+      </w:r>
+    </w:p>
+    <w:p>
+      <w:pPr>
         <w:keepNext/>
-        <w:spacing w:lineRule="auto" w:line="276" w:before="160" w:after="100"/>
+        <w:spacing w:lineRule="auto" w:line="276" w:before="160" w:after="60"/>
         <w:jc w:val="left"/>
         <w:pBdr>
           <w:bottom w:val="single" w:sz="6" w:space="2" w:color="1B365D"/>
@@ -83,13 +99,45 @@
           <w:color w:val="333333"/>
           <w:sz w:val="22"/>
         </w:rPr>
-        <w:t>Profissional em transição para Tecnologia da Informação, com dupla formação técnica pelo SENAI (Eletromecânica e Administração) e aprovado no Tecnólogo em Análise e Desenvolvimento de Sistemas (Facens). Destaco-me pela capacidade de identificar problemas reais da operação e convertê-los em soluções digitais práticas: na CBA, desenvolvi um sistema web (PWA) de gestão de ocorrências testado em piloto na Sala de Fornos 7, integrado a Power Automate e Excel Online. Experiência em suporte de TI (ServiceNow), Power BI e governança documental (Docnix). Promovido de Operador Júnior a Pleno em menos de 12 meses na experiência anterior. Disciplinado e autodidata, com aprendizado acelerado por projetos práticos e uso intensivo de IA.</w:t>
+        <w:t>Profissional técnico em transição para Tecnologia da Informação, com formação pelo SENAI em Eletromecânica e Administração, aprovado no Tecnólogo em Análise e Desenvolvimento de Sistemas pela Facens. Experiência em ambiente industrial, logística refrigerada, suporte operacional, governança documental, indicadores, inventários, sistemas corporativos e melhoria de processos.</w:t>
+      </w:r>
+    </w:p>
+    <w:p>
+      <w:pPr>
+        <w:spacing w:lineRule="auto" w:line="276" w:before="0" w:after="60"/>
+        <w:jc w:val="left"/>
+      </w:pPr>
+      <w:r>
+        <w:rPr>
+          <w:rFonts w:ascii="Arial" w:hAnsi="Arial" w:cs="Arial"/>
+          <w:b w:val="0"/>
+          <w:i w:val="0"/>
+          <w:color w:val="333333"/>
+          <w:sz w:val="22"/>
+        </w:rPr>
+        <w:t>Atuação na CBA com Docnix, ServiceNow, Power BI, Power Apps/ObraSoft, SAP, Excel e suporte técnico local, contribuindo para organização documental, controle de indicadores, gestão de materiais e digitalização de rotinas operacionais. Desenvolvi e testei em piloto um sistema web/PWA para gestão de ocorrências de fornos industriais, integrando Power Automate, Excel Online, GitHub e Cloudflare.</w:t>
+      </w:r>
+    </w:p>
+    <w:p>
+      <w:pPr>
+        <w:spacing w:lineRule="auto" w:line="276" w:before="0" w:after="60"/>
+        <w:jc w:val="left"/>
+      </w:pPr>
+      <w:r>
+        <w:rPr>
+          <w:rFonts w:ascii="Arial" w:hAnsi="Arial" w:cs="Arial"/>
+          <w:b w:val="0"/>
+          <w:i w:val="0"/>
+          <w:color w:val="333333"/>
+          <w:sz w:val="22"/>
+        </w:rPr>
+        <w:t>Perfil disciplinado, hands-on e autodidata, com facilidade para aprender ferramentas, resolver problemas práticos e transformar controles manuais em soluções mais organizadas, rastreáveis e eficientes.</w:t>
       </w:r>
     </w:p>
     <w:p>
       <w:pPr>
         <w:keepNext/>
-        <w:spacing w:lineRule="auto" w:line="276" w:before="160" w:after="100"/>
+        <w:spacing w:lineRule="auto" w:line="276" w:before="140" w:after="60"/>
         <w:jc w:val="left"/>
         <w:pBdr>
           <w:bottom w:val="single" w:sz="6" w:space="2" w:color="1B365D"/>
@@ -119,7 +167,7 @@
           <w:color w:val="333333"/>
           <w:sz w:val="22"/>
         </w:rPr>
-        <w:t>Companhia Brasileira de Alumínio (CBA)</w:t>
+        <w:t>COMPANHIA BRASILEIRA DE ALUMÍNIO — CBA</w:t>
       </w:r>
       <w:r>
         <w:rPr>
@@ -129,7 +177,23 @@
           <w:color w:val="333333"/>
           <w:sz w:val="22"/>
         </w:rPr>
-        <w:t xml:space="preserve"> — Alumínio/SP</w:t>
+        <w:t xml:space="preserve">  |  Alumínio/SP</w:t>
+      </w:r>
+    </w:p>
+    <w:p>
+      <w:pPr>
+        <w:spacing w:lineRule="auto" w:line="276" w:before="0" w:after="20"/>
+        <w:jc w:val="left"/>
+      </w:pPr>
+      <w:r>
+        <w:rPr>
+          <w:rFonts w:ascii="Arial" w:hAnsi="Arial" w:cs="Arial"/>
+          <w:b/>
+          <w:i w:val="0"/>
+          <w:color w:val="333333"/>
+          <w:sz w:val="22"/>
+        </w:rPr>
+        <w:t>Aprendiz – Suporte de Operações / Administrativo Técnico — Sala de Fornos 7</w:t>
       </w:r>
     </w:p>
     <w:p>
@@ -140,27 +204,17 @@
       <w:r>
         <w:rPr>
           <w:rFonts w:ascii="Arial" w:hAnsi="Arial" w:cs="Arial"/>
-          <w:b/>
-          <w:i w:val="0"/>
-          <w:color w:val="333333"/>
-          <w:sz w:val="22"/>
-        </w:rPr>
-        <w:t>Aprendiz – Suporte de Operações (Sala de Fornos 7 – ADM)</w:t>
-      </w:r>
-      <w:r>
-        <w:rPr>
-          <w:rFonts w:ascii="Arial" w:hAnsi="Arial" w:cs="Arial"/>
           <w:b w:val="0"/>
           <w:i/>
           <w:color w:val="333333"/>
           <w:sz w:val="22"/>
         </w:rPr>
-        <w:t xml:space="preserve">  |  jan/2025 – jun/2026</w:t>
+        <w:t>jan/2025 – jun/2026</w:t>
       </w:r>
     </w:p>
     <w:p>
       <w:pPr>
-        <w:spacing w:lineRule="auto" w:line="276" w:before="0" w:after="40"/>
+        <w:spacing w:lineRule="auto" w:line="276" w:before="0" w:after="20"/>
         <w:ind w:left="283" w:hanging="283"/>
         <w:jc w:val="left"/>
       </w:pPr>
@@ -183,12 +237,12 @@
           <w:color w:val="333333"/>
           <w:sz w:val="22"/>
         </w:rPr>
-        <w:t>Governança documental no Docnix: pesquisa avançada, verificação de vigência e distribuição de Procedimentos Operacionais, Padrões de Trabalho e FMEAs.</w:t>
+        <w:t>Atuação em suporte administrativo e operacional na Sala de Fornos 7, apoiando rotinas de produção, segurança, manutenção, documentação, indicadores e controle de materiais.</w:t>
       </w:r>
     </w:p>
     <w:p>
       <w:pPr>
-        <w:spacing w:lineRule="auto" w:line="276" w:before="0" w:after="40"/>
+        <w:spacing w:lineRule="auto" w:line="276" w:before="0" w:after="20"/>
         <w:ind w:left="283" w:hanging="283"/>
         <w:jc w:val="left"/>
       </w:pPr>
@@ -211,12 +265,12 @@
           <w:color w:val="333333"/>
           <w:sz w:val="22"/>
         </w:rPr>
-        <w:t>Key User local de TI: chamados no ServiceNow, recuperação de computadores bloqueados por BitLocker e suporte a impressoras e acessos corporativos.</w:t>
+        <w:t>Gestão e governança documental no Docnix, com pesquisa avançada, verificação de vigência, organização e distribuição de Procedimentos Operacionais, Padrões de Trabalho e FMEAs.</w:t>
       </w:r>
     </w:p>
     <w:p>
       <w:pPr>
-        <w:spacing w:lineRule="auto" w:line="276" w:before="0" w:after="40"/>
+        <w:spacing w:lineRule="auto" w:line="276" w:before="0" w:after="20"/>
         <w:ind w:left="283" w:hanging="283"/>
         <w:jc w:val="left"/>
       </w:pPr>
@@ -239,12 +293,12 @@
           <w:color w:val="333333"/>
           <w:sz w:val="22"/>
         </w:rPr>
-        <w:t>Monitoramento diário de indicadores de segurança (DDS e abrangências) em Power BI e ObraSoft/Power Apps, com geração de relatórios e baixa de pendências.</w:t>
+        <w:t>Atuação como apoio local de TI/Key User, com abertura e acompanhamento de chamados no ServiceNow, suporte a acessos, impressoras, equipamentos bloqueados por BitLocker e demandas técnicas do setor.</w:t>
       </w:r>
     </w:p>
     <w:p>
       <w:pPr>
-        <w:spacing w:lineRule="auto" w:line="276" w:before="0" w:after="40"/>
+        <w:spacing w:lineRule="auto" w:line="276" w:before="0" w:after="20"/>
         <w:ind w:left="283" w:hanging="283"/>
         <w:jc w:val="left"/>
       </w:pPr>
@@ -267,12 +321,12 @@
           <w:color w:val="333333"/>
           <w:sz w:val="22"/>
         </w:rPr>
-        <w:t>Inventário completo do almoxarifado do setor, com planilhas de controle de entrada e saída em Excel, consultas de saldo no SAP e gestão da distribuição de EPIs.</w:t>
+        <w:t>Monitoramento diário de indicadores de segurança e operação, incluindo DDS, abrangências, pendências e registros em Power BI, Power Apps e ObraSoft.</w:t>
       </w:r>
     </w:p>
     <w:p>
       <w:pPr>
-        <w:spacing w:lineRule="auto" w:line="276" w:before="0" w:after="40"/>
+        <w:spacing w:lineRule="auto" w:line="276" w:before="0" w:after="20"/>
         <w:ind w:left="283" w:hanging="283"/>
         <w:jc w:val="left"/>
       </w:pPr>
@@ -295,64 +349,12 @@
           <w:color w:val="333333"/>
           <w:sz w:val="22"/>
         </w:rPr>
-        <w:t>Melhoria de processos: substituí anotações em lousa por checklists padronizados com histórico auditável — iniciativa que evoluiu para o sistema web descrito em Projetos de Tecnologia.</w:t>
+        <w:t>Elaboração e atualização de planilhas de controle em Excel, apoiando inventários, entrada e saída de materiais, distribuição de EPIs e consultas de saldo no SAP.</w:t>
       </w:r>
     </w:p>
     <w:p>
       <w:pPr>
-        <w:spacing w:lineRule="auto" w:line="276" w:before="120" w:after="20"/>
-        <w:jc w:val="left"/>
-      </w:pPr>
-      <w:r>
-        <w:rPr>
-          <w:rFonts w:ascii="Arial" w:hAnsi="Arial" w:cs="Arial"/>
-          <w:b/>
-          <w:i w:val="0"/>
-          <w:color w:val="333333"/>
-          <w:sz w:val="22"/>
-        </w:rPr>
-        <w:t>CEFRI / SuperFrio – Logística e Armazenagem Frigorificada</w:t>
-      </w:r>
-      <w:r>
-        <w:rPr>
-          <w:rFonts w:ascii="Arial" w:hAnsi="Arial" w:cs="Arial"/>
-          <w:b w:val="0"/>
-          <w:i w:val="0"/>
-          <w:color w:val="333333"/>
-          <w:sz w:val="22"/>
-        </w:rPr>
-        <w:t xml:space="preserve"> — Mairinque/SP</w:t>
-      </w:r>
-    </w:p>
-    <w:p>
-      <w:pPr>
-        <w:spacing w:lineRule="auto" w:line="276" w:before="0" w:after="40"/>
-        <w:jc w:val="left"/>
-      </w:pPr>
-      <w:r>
-        <w:rPr>
-          <w:rFonts w:ascii="Arial" w:hAnsi="Arial" w:cs="Arial"/>
-          <w:b/>
-          <w:i w:val="0"/>
-          <w:color w:val="333333"/>
-          <w:sz w:val="22"/>
-        </w:rPr>
-        <w:t>Operador de Armazém Júnior → Pleno</w:t>
-      </w:r>
-      <w:r>
-        <w:rPr>
-          <w:rFonts w:ascii="Arial" w:hAnsi="Arial" w:cs="Arial"/>
-          <w:b w:val="0"/>
-          <w:i/>
-          <w:color w:val="333333"/>
-          <w:sz w:val="22"/>
-        </w:rPr>
-        <w:t xml:space="preserve">  |  abr/2023 – jan/2025</w:t>
-      </w:r>
-    </w:p>
-    <w:p>
-      <w:pPr>
-        <w:spacing w:lineRule="auto" w:line="276" w:before="0" w:after="40"/>
+        <w:spacing w:lineRule="auto" w:line="276" w:before="0" w:after="20"/>
         <w:ind w:left="283" w:hanging="283"/>
         <w:jc w:val="left"/>
       </w:pPr>
@@ -375,12 +377,12 @@
           <w:color w:val="333333"/>
           <w:sz w:val="22"/>
         </w:rPr>
-        <w:t>Promovido de Operador Júnior a Pleno em menos de 12 meses, em reconhecimento ao desempenho, à confiabilidade e à produtividade na operação.</w:t>
+        <w:t>Organização do almoxarifado do setor com aplicação de boas práticas de controle, 5S, rastreabilidade de materiais e padronização de registros.</w:t>
       </w:r>
     </w:p>
     <w:p>
       <w:pPr>
-        <w:spacing w:lineRule="auto" w:line="276" w:before="0" w:after="40"/>
+        <w:spacing w:lineRule="auto" w:line="276" w:before="0" w:after="20"/>
         <w:ind w:left="283" w:hanging="283"/>
         <w:jc w:val="left"/>
       </w:pPr>
@@ -403,12 +405,12 @@
           <w:color w:val="333333"/>
           <w:sz w:val="22"/>
         </w:rPr>
-        <w:t>Operação de empilhadeiras (NR-11) e separação de cargas em câmaras frias a -25 °C com coletor de dados e WMS Blue Yonder, além de expedição e carregamento de veículos em turno noturno de alto giro.</w:t>
+        <w:t>Identificação de falhas em controles manuais e criação de soluções digitais para aumentar rastreabilidade, reduzir perda de informação e melhorar a tomada de decisão.</w:t>
       </w:r>
     </w:p>
     <w:p>
       <w:pPr>
-        <w:spacing w:lineRule="auto" w:line="276" w:before="0" w:after="40"/>
+        <w:spacing w:lineRule="auto" w:line="276" w:before="0" w:after="60"/>
         <w:ind w:left="283" w:hanging="283"/>
         <w:jc w:val="left"/>
       </w:pPr>
@@ -431,12 +433,12 @@
           <w:color w:val="333333"/>
           <w:sz w:val="22"/>
         </w:rPr>
-        <w:t>Capacitação contínua em paralelo ao turno: PCP (40h), Metrologia (60h), Excel Avançado (40h), Power BI (32h) e Python (30h).</w:t>
+        <w:t>Desenvolvimento de checklists e controles digitais que evoluíram para um sistema web de gestão de ocorrências industriais, testado em piloto na área.</w:t>
       </w:r>
     </w:p>
     <w:p>
       <w:pPr>
-        <w:spacing w:lineRule="auto" w:line="276" w:before="120" w:after="20"/>
+        <w:spacing w:lineRule="auto" w:line="276" w:before="0" w:after="20"/>
         <w:jc w:val="left"/>
       </w:pPr>
       <w:r>
@@ -447,7 +449,7 @@
           <w:color w:val="333333"/>
           <w:sz w:val="22"/>
         </w:rPr>
-        <w:t>Supermercado São Roque – Centro de Distribuição</w:t>
+        <w:t>CEFRI / SUPERFRIO — Logística e Armazenagem Frigorificada</w:t>
       </w:r>
       <w:r>
         <w:rPr>
@@ -457,7 +459,23 @@
           <w:color w:val="333333"/>
           <w:sz w:val="22"/>
         </w:rPr>
-        <w:t xml:space="preserve"> — São Roque/SP</w:t>
+        <w:t xml:space="preserve">  |  Mairinque/SP</w:t>
+      </w:r>
+    </w:p>
+    <w:p>
+      <w:pPr>
+        <w:spacing w:lineRule="auto" w:line="276" w:before="0" w:after="20"/>
+        <w:jc w:val="left"/>
+      </w:pPr>
+      <w:r>
+        <w:rPr>
+          <w:rFonts w:ascii="Arial" w:hAnsi="Arial" w:cs="Arial"/>
+          <w:b/>
+          <w:i w:val="0"/>
+          <w:color w:val="333333"/>
+          <w:sz w:val="22"/>
+        </w:rPr>
+        <w:t>Operador de Armazém Júnior → Pleno</w:t>
       </w:r>
     </w:p>
     <w:p>
@@ -468,27 +486,17 @@
       <w:r>
         <w:rPr>
           <w:rFonts w:ascii="Arial" w:hAnsi="Arial" w:cs="Arial"/>
-          <w:b/>
-          <w:i w:val="0"/>
-          <w:color w:val="333333"/>
-          <w:sz w:val="22"/>
-        </w:rPr>
-        <w:t>Ajudante Operacional</w:t>
-      </w:r>
-      <w:r>
-        <w:rPr>
-          <w:rFonts w:ascii="Arial" w:hAnsi="Arial" w:cs="Arial"/>
           <w:b w:val="0"/>
           <w:i/>
           <w:color w:val="333333"/>
           <w:sz w:val="22"/>
         </w:rPr>
-        <w:t xml:space="preserve">  |  ago/2021 – jul/2022</w:t>
+        <w:t>abr/2023 – jan/2025</w:t>
       </w:r>
     </w:p>
     <w:p>
       <w:pPr>
-        <w:spacing w:lineRule="auto" w:line="276" w:before="0" w:after="40"/>
+        <w:spacing w:lineRule="auto" w:line="276" w:before="0" w:after="20"/>
         <w:ind w:left="283" w:hanging="283"/>
         <w:jc w:val="left"/>
       </w:pPr>
@@ -511,48 +519,12 @@
           <w:color w:val="333333"/>
           <w:sz w:val="22"/>
         </w:rPr>
-        <w:t>Carregamento de caminhões em docas, paletização com filme stretch, organização do centro de distribuição e controle de devolução de ativos (caixas) a fornecedores.</w:t>
+        <w:t>Promovido de Operador Júnior a Pleno em menos de 12 meses, em reconhecimento ao desempenho, confiabilidade, produtividade e adaptação à rotina operacional.</w:t>
       </w:r>
     </w:p>
     <w:p>
       <w:pPr>
-        <w:keepNext/>
-        <w:spacing w:lineRule="auto" w:line="276" w:before="160" w:after="100"/>
-        <w:jc w:val="left"/>
-        <w:pBdr>
-          <w:bottom w:val="single" w:sz="6" w:space="2" w:color="1B365D"/>
-        </w:pBdr>
-      </w:pPr>
-      <w:r>
-        <w:rPr>
-          <w:rFonts w:ascii="Arial" w:hAnsi="Arial" w:cs="Arial"/>
-          <w:b/>
-          <w:i w:val="0"/>
-          <w:color w:val="1B365D"/>
-          <w:sz w:val="28"/>
-        </w:rPr>
-        <w:t>PROJETOS DE TECNOLOGIA</w:t>
-      </w:r>
-    </w:p>
-    <w:p>
-      <w:pPr>
-        <w:spacing w:lineRule="auto" w:line="276" w:before="40" w:after="20"/>
-        <w:jc w:val="left"/>
-      </w:pPr>
-      <w:r>
-        <w:rPr>
-          <w:rFonts w:ascii="Arial" w:hAnsi="Arial" w:cs="Arial"/>
-          <w:b/>
-          <w:i w:val="0"/>
-          <w:color w:val="333333"/>
-          <w:sz w:val="22"/>
-        </w:rPr>
-        <w:t>Sistema de Gestão de Ocorrências de Fornos Industriais (projeto autoral)</w:t>
-      </w:r>
-    </w:p>
-    <w:p>
-      <w:pPr>
-        <w:spacing w:lineRule="auto" w:line="276" w:before="0" w:after="40"/>
+        <w:spacing w:lineRule="auto" w:line="276" w:before="0" w:after="20"/>
         <w:ind w:left="283" w:hanging="283"/>
         <w:jc w:val="left"/>
       </w:pPr>
@@ -575,12 +547,12 @@
           <w:color w:val="333333"/>
           <w:sz w:val="22"/>
         </w:rPr>
-        <w:t>Dor crítica identificada: controles manuais em lousa, sem histórico nem análise. Desenvolvi e testei em piloto uma aplicação web (PWA) com dashboards (Pareto, ranking de fornos críticos), alertas automáticos, modo TV e resumo executivo.</w:t>
+        <w:t>Operação de empilhadeiras, conforme NR-11, em ambiente refrigerado de alta demanda, com movimentação, separação, organização e expedição de cargas.</w:t>
       </w:r>
     </w:p>
     <w:p>
       <w:pPr>
-        <w:spacing w:lineRule="auto" w:line="276" w:before="0" w:after="40"/>
+        <w:spacing w:lineRule="auto" w:line="276" w:before="0" w:after="20"/>
         <w:ind w:left="283" w:hanging="283"/>
         <w:jc w:val="left"/>
       </w:pPr>
@@ -598,12 +570,30 @@
       <w:r>
         <w:rPr>
           <w:rFonts w:ascii="Arial" w:hAnsi="Arial" w:cs="Arial"/>
-          <w:b/>
+          <w:b w:val="0"/>
           <w:i w:val="0"/>
           <w:color w:val="333333"/>
           <w:sz w:val="22"/>
         </w:rPr>
-        <w:t xml:space="preserve">Responsabilidades: </w:t>
+        <w:t>Atuação em câmaras frias de até -25 °C, realizando picking, conferência, armazenagem, carregamento e suporte à operação logística em turno noturno.</w:t>
+      </w:r>
+    </w:p>
+    <w:p>
+      <w:pPr>
+        <w:spacing w:lineRule="auto" w:line="276" w:before="0" w:after="20"/>
+        <w:ind w:left="283" w:hanging="283"/>
+        <w:jc w:val="left"/>
+      </w:pPr>
+      <w:r>
+        <w:rPr>
+          <w:rFonts w:ascii="Arial" w:hAnsi="Arial" w:cs="Arial"/>
+          <w:b w:val="0"/>
+          <w:i w:val="0"/>
+          <w:color w:val="333333"/>
+          <w:sz w:val="22"/>
+        </w:rPr>
+        <w:t>•</w:t>
+        <w:tab/>
       </w:r>
       <w:r>
         <w:rPr>
@@ -613,12 +603,358 @@
           <w:color w:val="333333"/>
           <w:sz w:val="22"/>
         </w:rPr>
-        <w:t>levantamento de requisitos com a equipe, desenvolvimento iterativo com apoio de IA (Claude, Copilot), integração Power Automate + Excel Online, relatórios automáticos por e-mail e deploy via GitHub + Cloudflare.</w:t>
+        <w:t>Utilização de coletor de dados e sistema WMS Blue Yonder para controle de movimentações, separação de pedidos, localização de produtos e apoio ao fluxo de estoque.</w:t>
       </w:r>
     </w:p>
     <w:p>
       <w:pPr>
-        <w:spacing w:lineRule="auto" w:line="276" w:before="0" w:after="80"/>
+        <w:spacing w:lineRule="auto" w:line="276" w:before="0" w:after="20"/>
+        <w:ind w:left="283" w:hanging="283"/>
+        <w:jc w:val="left"/>
+      </w:pPr>
+      <w:r>
+        <w:rPr>
+          <w:rFonts w:ascii="Arial" w:hAnsi="Arial" w:cs="Arial"/>
+          <w:b w:val="0"/>
+          <w:i w:val="0"/>
+          <w:color w:val="333333"/>
+          <w:sz w:val="22"/>
+        </w:rPr>
+        <w:t>•</w:t>
+        <w:tab/>
+      </w:r>
+      <w:r>
+        <w:rPr>
+          <w:rFonts w:ascii="Arial" w:hAnsi="Arial" w:cs="Arial"/>
+          <w:b w:val="0"/>
+          <w:i w:val="0"/>
+          <w:color w:val="333333"/>
+          <w:sz w:val="22"/>
+        </w:rPr>
+        <w:t>Apoio à organização do armazém, controle de produtividade, segurança operacional e cumprimento de procedimentos internos.</w:t>
+      </w:r>
+    </w:p>
+    <w:p>
+      <w:pPr>
+        <w:spacing w:lineRule="auto" w:line="276" w:before="0" w:after="60"/>
+        <w:ind w:left="283" w:hanging="283"/>
+        <w:jc w:val="left"/>
+      </w:pPr>
+      <w:r>
+        <w:rPr>
+          <w:rFonts w:ascii="Arial" w:hAnsi="Arial" w:cs="Arial"/>
+          <w:b w:val="0"/>
+          <w:i w:val="0"/>
+          <w:color w:val="333333"/>
+          <w:sz w:val="22"/>
+        </w:rPr>
+        <w:t>•</w:t>
+        <w:tab/>
+      </w:r>
+      <w:r>
+        <w:rPr>
+          <w:rFonts w:ascii="Arial" w:hAnsi="Arial" w:cs="Arial"/>
+          <w:b w:val="0"/>
+          <w:i w:val="0"/>
+          <w:color w:val="333333"/>
+          <w:sz w:val="22"/>
+        </w:rPr>
+        <w:t>Capacitação contínua em paralelo ao trabalho, com cursos em Excel Avançado, Power BI, Fundamentos de Python, PCP e Metrologia.</w:t>
+      </w:r>
+    </w:p>
+    <w:p>
+      <w:pPr>
+        <w:spacing w:lineRule="auto" w:line="276" w:before="0" w:after="20"/>
+        <w:jc w:val="left"/>
+      </w:pPr>
+      <w:r>
+        <w:rPr>
+          <w:rFonts w:ascii="Arial" w:hAnsi="Arial" w:cs="Arial"/>
+          <w:b/>
+          <w:i w:val="0"/>
+          <w:color w:val="333333"/>
+          <w:sz w:val="22"/>
+        </w:rPr>
+        <w:t>SUPERMERCADO SÃO ROQUE — Centro de Distribuição</w:t>
+      </w:r>
+      <w:r>
+        <w:rPr>
+          <w:rFonts w:ascii="Arial" w:hAnsi="Arial" w:cs="Arial"/>
+          <w:b w:val="0"/>
+          <w:i w:val="0"/>
+          <w:color w:val="333333"/>
+          <w:sz w:val="22"/>
+        </w:rPr>
+        <w:t xml:space="preserve">  |  São Roque/SP</w:t>
+      </w:r>
+    </w:p>
+    <w:p>
+      <w:pPr>
+        <w:spacing w:lineRule="auto" w:line="276" w:before="0" w:after="20"/>
+        <w:jc w:val="left"/>
+      </w:pPr>
+      <w:r>
+        <w:rPr>
+          <w:rFonts w:ascii="Arial" w:hAnsi="Arial" w:cs="Arial"/>
+          <w:b/>
+          <w:i w:val="0"/>
+          <w:color w:val="333333"/>
+          <w:sz w:val="22"/>
+        </w:rPr>
+        <w:t>Ajudante Operacional</w:t>
+      </w:r>
+    </w:p>
+    <w:p>
+      <w:pPr>
+        <w:spacing w:lineRule="auto" w:line="276" w:before="0" w:after="40"/>
+        <w:jc w:val="left"/>
+      </w:pPr>
+      <w:r>
+        <w:rPr>
+          <w:rFonts w:ascii="Arial" w:hAnsi="Arial" w:cs="Arial"/>
+          <w:b w:val="0"/>
+          <w:i/>
+          <w:color w:val="333333"/>
+          <w:sz w:val="22"/>
+        </w:rPr>
+        <w:t>ago/2021 – jul/2022</w:t>
+      </w:r>
+    </w:p>
+    <w:p>
+      <w:pPr>
+        <w:spacing w:lineRule="auto" w:line="276" w:before="0" w:after="20"/>
+        <w:ind w:left="283" w:hanging="283"/>
+        <w:jc w:val="left"/>
+      </w:pPr>
+      <w:r>
+        <w:rPr>
+          <w:rFonts w:ascii="Arial" w:hAnsi="Arial" w:cs="Arial"/>
+          <w:b w:val="0"/>
+          <w:i w:val="0"/>
+          <w:color w:val="333333"/>
+          <w:sz w:val="22"/>
+        </w:rPr>
+        <w:t>•</w:t>
+        <w:tab/>
+      </w:r>
+      <w:r>
+        <w:rPr>
+          <w:rFonts w:ascii="Arial" w:hAnsi="Arial" w:cs="Arial"/>
+          <w:b w:val="0"/>
+          <w:i w:val="0"/>
+          <w:color w:val="333333"/>
+          <w:sz w:val="22"/>
+        </w:rPr>
+        <w:t>Apoio às rotinas de centro de distribuição, incluindo carregamento de caminhões, paletização, organização de estoque, movimentação de mercadorias e separação de cargas.</w:t>
+      </w:r>
+    </w:p>
+    <w:p>
+      <w:pPr>
+        <w:spacing w:lineRule="auto" w:line="276" w:before="0" w:after="60"/>
+        <w:ind w:left="283" w:hanging="283"/>
+        <w:jc w:val="left"/>
+      </w:pPr>
+      <w:r>
+        <w:rPr>
+          <w:rFonts w:ascii="Arial" w:hAnsi="Arial" w:cs="Arial"/>
+          <w:b w:val="0"/>
+          <w:i w:val="0"/>
+          <w:color w:val="333333"/>
+          <w:sz w:val="22"/>
+        </w:rPr>
+        <w:t>•</w:t>
+        <w:tab/>
+      </w:r>
+      <w:r>
+        <w:rPr>
+          <w:rFonts w:ascii="Arial" w:hAnsi="Arial" w:cs="Arial"/>
+          <w:b w:val="0"/>
+          <w:i w:val="0"/>
+          <w:color w:val="333333"/>
+          <w:sz w:val="22"/>
+        </w:rPr>
+        <w:t>Controle de devolução de ativos, como caixas e materiais retornáveis, auxiliando na organização e fluxo operacional do setor.</w:t>
+      </w:r>
+    </w:p>
+    <w:p>
+      <w:pPr>
+        <w:keepNext/>
+        <w:spacing w:lineRule="auto" w:line="276" w:before="140" w:after="60"/>
+        <w:jc w:val="left"/>
+        <w:pBdr>
+          <w:bottom w:val="single" w:sz="6" w:space="2" w:color="1B365D"/>
+        </w:pBdr>
+      </w:pPr>
+      <w:r>
+        <w:rPr>
+          <w:rFonts w:ascii="Arial" w:hAnsi="Arial" w:cs="Arial"/>
+          <w:b/>
+          <w:i w:val="0"/>
+          <w:color w:val="1B365D"/>
+          <w:sz w:val="28"/>
+        </w:rPr>
+        <w:t>PROJETOS DE TECNOLOGIA</w:t>
+      </w:r>
+    </w:p>
+    <w:p>
+      <w:pPr>
+        <w:spacing w:lineRule="auto" w:line="276" w:before="40" w:after="40"/>
+        <w:jc w:val="left"/>
+      </w:pPr>
+      <w:r>
+        <w:rPr>
+          <w:rFonts w:ascii="Arial" w:hAnsi="Arial" w:cs="Arial"/>
+          <w:b/>
+          <w:i w:val="0"/>
+          <w:color w:val="333333"/>
+          <w:sz w:val="22"/>
+        </w:rPr>
+        <w:t>Sistema de Gestão de Ocorrências de Fornos Industriais — Projeto Autoral</w:t>
+      </w:r>
+    </w:p>
+    <w:p>
+      <w:pPr>
+        <w:spacing w:lineRule="auto" w:line="276" w:before="0" w:after="20"/>
+        <w:ind w:left="283" w:hanging="283"/>
+        <w:jc w:val="left"/>
+      </w:pPr>
+      <w:r>
+        <w:rPr>
+          <w:rFonts w:ascii="Arial" w:hAnsi="Arial" w:cs="Arial"/>
+          <w:b w:val="0"/>
+          <w:i w:val="0"/>
+          <w:color w:val="333333"/>
+          <w:sz w:val="22"/>
+        </w:rPr>
+        <w:t>•</w:t>
+        <w:tab/>
+      </w:r>
+      <w:r>
+        <w:rPr>
+          <w:rFonts w:ascii="Arial" w:hAnsi="Arial" w:cs="Arial"/>
+          <w:b w:val="0"/>
+          <w:i w:val="0"/>
+          <w:color w:val="333333"/>
+          <w:sz w:val="22"/>
+        </w:rPr>
+        <w:t>Identificação de uma dor real da operação: controles manuais em lousa, baixa rastreabilidade, ausência de histórico estruturado e dificuldade para análise de recorrências.</w:t>
+      </w:r>
+    </w:p>
+    <w:p>
+      <w:pPr>
+        <w:spacing w:lineRule="auto" w:line="276" w:before="0" w:after="20"/>
+        <w:ind w:left="283" w:hanging="283"/>
+        <w:jc w:val="left"/>
+      </w:pPr>
+      <w:r>
+        <w:rPr>
+          <w:rFonts w:ascii="Arial" w:hAnsi="Arial" w:cs="Arial"/>
+          <w:b w:val="0"/>
+          <w:i w:val="0"/>
+          <w:color w:val="333333"/>
+          <w:sz w:val="22"/>
+        </w:rPr>
+        <w:t>•</w:t>
+        <w:tab/>
+      </w:r>
+      <w:r>
+        <w:rPr>
+          <w:rFonts w:ascii="Arial" w:hAnsi="Arial" w:cs="Arial"/>
+          <w:b w:val="0"/>
+          <w:i w:val="0"/>
+          <w:color w:val="333333"/>
+          <w:sz w:val="22"/>
+        </w:rPr>
+        <w:t>Desenvolvimento de uma aplicação web PWA para registrar ocorrências, acompanhar histórico, visualizar fornos críticos, gerar rankings, aplicar análise de Pareto e apoiar decisões operacionais.</w:t>
+      </w:r>
+    </w:p>
+    <w:p>
+      <w:pPr>
+        <w:spacing w:lineRule="auto" w:line="276" w:before="0" w:after="20"/>
+        <w:ind w:left="283" w:hanging="283"/>
+        <w:jc w:val="left"/>
+      </w:pPr>
+      <w:r>
+        <w:rPr>
+          <w:rFonts w:ascii="Arial" w:hAnsi="Arial" w:cs="Arial"/>
+          <w:b w:val="0"/>
+          <w:i w:val="0"/>
+          <w:color w:val="333333"/>
+          <w:sz w:val="22"/>
+        </w:rPr>
+        <w:t>•</w:t>
+        <w:tab/>
+      </w:r>
+      <w:r>
+        <w:rPr>
+          <w:rFonts w:ascii="Arial" w:hAnsi="Arial" w:cs="Arial"/>
+          <w:b w:val="0"/>
+          <w:i w:val="0"/>
+          <w:color w:val="333333"/>
+          <w:sz w:val="22"/>
+        </w:rPr>
+        <w:t>Integração com Power Automate e Excel Online, permitindo armazenamento dos registros, automações e apoio à geração de relatórios.</w:t>
+      </w:r>
+    </w:p>
+    <w:p>
+      <w:pPr>
+        <w:spacing w:lineRule="auto" w:line="276" w:before="0" w:after="20"/>
+        <w:ind w:left="283" w:hanging="283"/>
+        <w:jc w:val="left"/>
+      </w:pPr>
+      <w:r>
+        <w:rPr>
+          <w:rFonts w:ascii="Arial" w:hAnsi="Arial" w:cs="Arial"/>
+          <w:b w:val="0"/>
+          <w:i w:val="0"/>
+          <w:color w:val="333333"/>
+          <w:sz w:val="22"/>
+        </w:rPr>
+        <w:t>•</w:t>
+        <w:tab/>
+      </w:r>
+      <w:r>
+        <w:rPr>
+          <w:rFonts w:ascii="Arial" w:hAnsi="Arial" w:cs="Arial"/>
+          <w:b w:val="0"/>
+          <w:i w:val="0"/>
+          <w:color w:val="333333"/>
+          <w:sz w:val="22"/>
+        </w:rPr>
+        <w:t>Deploy e testes utilizando GitHub e Cloudflare, com foco em acesso simples, visualização prática e uso em ambiente operacional.</w:t>
+      </w:r>
+    </w:p>
+    <w:p>
+      <w:pPr>
+        <w:spacing w:lineRule="auto" w:line="276" w:before="0" w:after="20"/>
+        <w:ind w:left="283" w:hanging="283"/>
+        <w:jc w:val="left"/>
+      </w:pPr>
+      <w:r>
+        <w:rPr>
+          <w:rFonts w:ascii="Arial" w:hAnsi="Arial" w:cs="Arial"/>
+          <w:b w:val="0"/>
+          <w:i w:val="0"/>
+          <w:color w:val="333333"/>
+          <w:sz w:val="22"/>
+        </w:rPr>
+        <w:t>•</w:t>
+        <w:tab/>
+      </w:r>
+      <w:r>
+        <w:rPr>
+          <w:rFonts w:ascii="Arial" w:hAnsi="Arial" w:cs="Arial"/>
+          <w:b w:val="0"/>
+          <w:i w:val="0"/>
+          <w:color w:val="333333"/>
+          <w:sz w:val="22"/>
+        </w:rPr>
+        <w:t>Uso de desenvolvimento assistido por IA, com apoio de ferramentas como Claude, Copilot e ChatGPT para estruturar telas, revisar lógica, melhorar código e acelerar prototipagem.</w:t>
+      </w:r>
+    </w:p>
+    <w:p>
+      <w:pPr>
+        <w:spacing w:lineRule="auto" w:line="276" w:before="0" w:after="60"/>
         <w:ind w:left="283" w:hanging="283"/>
         <w:jc w:val="left"/>
       </w:pPr>
@@ -651,12 +987,12 @@
           <w:color w:val="333333"/>
           <w:sz w:val="22"/>
         </w:rPr>
-        <w:t>registros manuais substituídos por um sistema digital auditável e visual, facilitando a priorização dos fornos críticos e a tomada de decisão.</w:t>
+        <w:t>substituição de controles soltos por um modelo digital mais rastreável, visual e organizado, facilitando a priorização de problemas e o acompanhamento de ocorrências.</w:t>
       </w:r>
     </w:p>
     <w:p>
       <w:pPr>
-        <w:spacing w:lineRule="auto" w:line="276" w:before="0" w:after="20"/>
+        <w:spacing w:lineRule="auto" w:line="276" w:before="0" w:after="40"/>
         <w:jc w:val="left"/>
       </w:pPr>
       <w:r>
@@ -667,7 +1003,63 @@
           <w:color w:val="333333"/>
           <w:sz w:val="22"/>
         </w:rPr>
-        <w:t>Sistema de Gestão de Estoque LIS (projeto acadêmico – SENAI)</w:t>
+        <w:t>Sistema de Gestão de Estoque LIS — Projeto Acadêmico SENAI</w:t>
+      </w:r>
+    </w:p>
+    <w:p>
+      <w:pPr>
+        <w:spacing w:lineRule="auto" w:line="276" w:before="0" w:after="20"/>
+        <w:ind w:left="283" w:hanging="283"/>
+        <w:jc w:val="left"/>
+      </w:pPr>
+      <w:r>
+        <w:rPr>
+          <w:rFonts w:ascii="Arial" w:hAnsi="Arial" w:cs="Arial"/>
+          <w:b w:val="0"/>
+          <w:i w:val="0"/>
+          <w:color w:val="333333"/>
+          <w:sz w:val="22"/>
+        </w:rPr>
+        <w:t>•</w:t>
+        <w:tab/>
+      </w:r>
+      <w:r>
+        <w:rPr>
+          <w:rFonts w:ascii="Arial" w:hAnsi="Arial" w:cs="Arial"/>
+          <w:b w:val="0"/>
+          <w:i w:val="0"/>
+          <w:color w:val="333333"/>
+          <w:sz w:val="22"/>
+        </w:rPr>
+        <w:t>Desenvolvimento de site em HTML, JavaScript e GitHub Pages, integrado ao Excel Online via Power Automate.</w:t>
+      </w:r>
+    </w:p>
+    <w:p>
+      <w:pPr>
+        <w:spacing w:lineRule="auto" w:line="276" w:before="0" w:after="20"/>
+        <w:ind w:left="283" w:hanging="283"/>
+        <w:jc w:val="left"/>
+      </w:pPr>
+      <w:r>
+        <w:rPr>
+          <w:rFonts w:ascii="Arial" w:hAnsi="Arial" w:cs="Arial"/>
+          <w:b w:val="0"/>
+          <w:i w:val="0"/>
+          <w:color w:val="333333"/>
+          <w:sz w:val="22"/>
+        </w:rPr>
+        <w:t>•</w:t>
+        <w:tab/>
+      </w:r>
+      <w:r>
+        <w:rPr>
+          <w:rFonts w:ascii="Arial" w:hAnsi="Arial" w:cs="Arial"/>
+          <w:b w:val="0"/>
+          <w:i w:val="0"/>
+          <w:color w:val="333333"/>
+          <w:sz w:val="22"/>
+        </w:rPr>
+        <w:t>Criação de controles de entrada e saída, curva ABC, estoque de segurança, ponto de pedido e dashboards automáticos.</w:t>
       </w:r>
     </w:p>
     <w:p>
@@ -695,13 +1087,13 @@
           <w:color w:val="333333"/>
           <w:sz w:val="22"/>
         </w:rPr>
-        <w:t>Site em HTML/JavaScript hospedado no GitHub Pages e integrado ao Excel Online via Power Automate: lançamentos de entrada e saída em tempo real, curva ABC, estoque de segurança, ponto de pedido e dashboards automáticos.</w:t>
+        <w:t>Projeto voltado à melhoria da rastreabilidade, redução de controles manuais e apoio à tomada de decisão em rotinas de estoque.</w:t>
       </w:r>
     </w:p>
     <w:p>
       <w:pPr>
         <w:keepNext/>
-        <w:spacing w:lineRule="auto" w:line="276" w:before="160" w:after="100"/>
+        <w:spacing w:lineRule="auto" w:line="276" w:before="140" w:after="60"/>
         <w:jc w:val="left"/>
         <w:pBdr>
           <w:bottom w:val="single" w:sz="6" w:space="2" w:color="1B365D"/>
@@ -720,7 +1112,7 @@
     </w:p>
     <w:p>
       <w:pPr>
-        <w:spacing w:lineRule="auto" w:line="276" w:before="40" w:after="40"/>
+        <w:spacing w:lineRule="auto" w:line="276" w:before="40" w:after="20"/>
         <w:jc w:val="left"/>
       </w:pPr>
       <w:r>
@@ -731,7 +1123,7 @@
           <w:color w:val="333333"/>
           <w:sz w:val="22"/>
         </w:rPr>
-        <w:t>Tecnólogo em Análise e Desenvolvimento de Sistemas (EAD)</w:t>
+        <w:t>Tecnólogo em Análise e Desenvolvimento de Sistemas — Facens</w:t>
       </w:r>
       <w:r>
         <w:rPr>
@@ -741,12 +1133,28 @@
           <w:color w:val="333333"/>
           <w:sz w:val="22"/>
         </w:rPr>
-        <w:t xml:space="preserve"> — Facens, Sorocaba/SP. Aprovado; início em agosto/2026.</w:t>
+        <w:t xml:space="preserve">  |  Sorocaba/SP</w:t>
       </w:r>
     </w:p>
     <w:p>
       <w:pPr>
-        <w:spacing w:lineRule="auto" w:line="276" w:before="0" w:after="40"/>
+        <w:spacing w:lineRule="auto" w:line="276" w:before="0" w:after="60"/>
+        <w:jc w:val="left"/>
+      </w:pPr>
+      <w:r>
+        <w:rPr>
+          <w:rFonts w:ascii="Arial" w:hAnsi="Arial" w:cs="Arial"/>
+          <w:b w:val="0"/>
+          <w:i w:val="0"/>
+          <w:color w:val="333333"/>
+          <w:sz w:val="22"/>
+        </w:rPr>
+        <w:t>Aprovado — início em agosto/2026</w:t>
+      </w:r>
+    </w:p>
+    <w:p>
+      <w:pPr>
+        <w:spacing w:lineRule="auto" w:line="276" w:before="0" w:after="20"/>
         <w:jc w:val="left"/>
       </w:pPr>
       <w:r>
@@ -757,17 +1165,7 @@
           <w:color w:val="333333"/>
           <w:sz w:val="22"/>
         </w:rPr>
-        <w:t>Técnico em Administração</w:t>
-      </w:r>
-      <w:r>
-        <w:rPr>
-          <w:rFonts w:ascii="Arial" w:hAnsi="Arial" w:cs="Arial"/>
-          <w:b w:val="0"/>
-          <w:i w:val="0"/>
-          <w:color w:val="333333"/>
-          <w:sz w:val="22"/>
-        </w:rPr>
-        <w:t xml:space="preserve"> — SENAI (1.200h). Diploma em junho/2026 — Aprendiz CBA.</w:t>
+        <w:t>Técnico em Administração — SENAI</w:t>
       </w:r>
     </w:p>
     <w:p>
@@ -778,13 +1176,35 @@
       <w:r>
         <w:rPr>
           <w:rFonts w:ascii="Arial" w:hAnsi="Arial" w:cs="Arial"/>
+          <w:b w:val="0"/>
+          <w:i w:val="0"/>
+          <w:color w:val="333333"/>
+          <w:sz w:val="22"/>
+        </w:rPr>
+        <w:t>Carga horária: 1.200h  |  Conclusão: junho/2026</w:t>
+      </w:r>
+    </w:p>
+    <w:p>
+      <w:pPr>
+        <w:spacing w:lineRule="auto" w:line="276" w:before="0" w:after="20"/>
+        <w:jc w:val="left"/>
+      </w:pPr>
+      <w:r>
+        <w:rPr>
+          <w:rFonts w:ascii="Arial" w:hAnsi="Arial" w:cs="Arial"/>
           <w:b/>
           <w:i w:val="0"/>
           <w:color w:val="333333"/>
           <w:sz w:val="22"/>
         </w:rPr>
-        <w:t>Técnico em Eletromecânica</w:t>
+        <w:t>Técnico em Eletromecânica — SENAI Mairinque</w:t>
       </w:r>
+    </w:p>
+    <w:p>
+      <w:pPr>
+        <w:spacing w:lineRule="auto" w:line="276" w:before="0" w:after="60"/>
+        <w:jc w:val="left"/>
+      </w:pPr>
       <w:r>
         <w:rPr>
           <w:rFonts w:ascii="Arial" w:hAnsi="Arial" w:cs="Arial"/>
@@ -793,13 +1213,13 @@
           <w:color w:val="333333"/>
           <w:sz w:val="22"/>
         </w:rPr>
-        <w:t xml:space="preserve"> — SENAI Mairinque (1.500h). Diploma em junho/2025.</w:t>
+        <w:t>Carga horária: 1.500h  |  Conclusão: junho/2025</w:t>
       </w:r>
     </w:p>
     <w:p>
       <w:pPr>
         <w:keepNext/>
-        <w:spacing w:lineRule="auto" w:line="276" w:before="160" w:after="100"/>
+        <w:spacing w:lineRule="auto" w:line="276" w:before="140" w:after="60"/>
         <w:jc w:val="left"/>
         <w:pBdr>
           <w:bottom w:val="single" w:sz="6" w:space="2" w:color="1B365D"/>
@@ -818,7 +1238,7 @@
     </w:p>
     <w:p>
       <w:pPr>
-        <w:spacing w:lineRule="auto" w:line="276" w:before="0" w:after="40"/>
+        <w:spacing w:lineRule="auto" w:line="276" w:before="0" w:after="20"/>
         <w:ind w:left="283" w:hanging="283"/>
         <w:jc w:val="left"/>
       </w:pPr>
@@ -841,12 +1261,12 @@
           <w:color w:val="333333"/>
           <w:sz w:val="22"/>
         </w:rPr>
-        <w:t>Excel Avançado (40h), Power BI (32h) e Fundamentos do Python (30h) – SENAI (2024)</w:t>
+        <w:t>Excel Avançado — SENAI | 40h</w:t>
       </w:r>
     </w:p>
     <w:p>
       <w:pPr>
-        <w:spacing w:lineRule="auto" w:line="276" w:before="0" w:after="40"/>
+        <w:spacing w:lineRule="auto" w:line="276" w:before="0" w:after="20"/>
         <w:ind w:left="283" w:hanging="283"/>
         <w:jc w:val="left"/>
       </w:pPr>
@@ -869,12 +1289,12 @@
           <w:color w:val="333333"/>
           <w:sz w:val="22"/>
         </w:rPr>
-        <w:t>Lógica de Programação (14h), Segurança Cibernética (4h) e Desvendando a Indústria 4.0 (20h) – SENAI (2025)</w:t>
+        <w:t>Power BI — SENAI | 32h</w:t>
       </w:r>
     </w:p>
     <w:p>
       <w:pPr>
-        <w:spacing w:lineRule="auto" w:line="276" w:before="0" w:after="40"/>
+        <w:spacing w:lineRule="auto" w:line="276" w:before="0" w:after="20"/>
         <w:ind w:left="283" w:hanging="283"/>
         <w:jc w:val="left"/>
       </w:pPr>
@@ -897,12 +1317,12 @@
           <w:color w:val="333333"/>
           <w:sz w:val="22"/>
         </w:rPr>
-        <w:t>Fundamentos da Inteligência Artificial (8h) e Ética na Inteligência Artificial (4h) – SENAI (2025)</w:t>
+        <w:t>Fundamentos do Python — SENAI | 30h</w:t>
       </w:r>
     </w:p>
     <w:p>
       <w:pPr>
-        <w:spacing w:lineRule="auto" w:line="276" w:before="0" w:after="40"/>
+        <w:spacing w:lineRule="auto" w:line="276" w:before="0" w:after="20"/>
         <w:ind w:left="283" w:hanging="283"/>
         <w:jc w:val="left"/>
       </w:pPr>
@@ -925,12 +1345,12 @@
           <w:color w:val="333333"/>
           <w:sz w:val="22"/>
         </w:rPr>
-        <w:t>Caldeiraria Prática – AHCX Treinamentos / MJS Brasil (jan–jul/2026, em conclusão)</w:t>
+        <w:t>PCP — Planejamento e Controle da Produção — SENAI | 40h</w:t>
       </w:r>
     </w:p>
     <w:p>
       <w:pPr>
-        <w:spacing w:lineRule="auto" w:line="276" w:before="0" w:after="40"/>
+        <w:spacing w:lineRule="auto" w:line="276" w:before="0" w:after="20"/>
         <w:ind w:left="283" w:hanging="283"/>
         <w:jc w:val="left"/>
       </w:pPr>
@@ -953,7 +1373,203 @@
           <w:color w:val="333333"/>
           <w:sz w:val="22"/>
         </w:rPr>
-        <w:t>NR-11 – Operação de Empilhadeira – SENAI (32h, 2023); reciclagens NR-11 – SuperFrio (2024)</w:t>
+        <w:t>Metrologia Aplicada à Mecânica — SENAI | 60h</w:t>
+      </w:r>
+    </w:p>
+    <w:p>
+      <w:pPr>
+        <w:spacing w:lineRule="auto" w:line="276" w:before="0" w:after="20"/>
+        <w:ind w:left="283" w:hanging="283"/>
+        <w:jc w:val="left"/>
+      </w:pPr>
+      <w:r>
+        <w:rPr>
+          <w:rFonts w:ascii="Arial" w:hAnsi="Arial" w:cs="Arial"/>
+          <w:b w:val="0"/>
+          <w:i w:val="0"/>
+          <w:color w:val="333333"/>
+          <w:sz w:val="22"/>
+        </w:rPr>
+        <w:t>•</w:t>
+        <w:tab/>
+      </w:r>
+      <w:r>
+        <w:rPr>
+          <w:rFonts w:ascii="Arial" w:hAnsi="Arial" w:cs="Arial"/>
+          <w:b w:val="0"/>
+          <w:i w:val="0"/>
+          <w:color w:val="333333"/>
+          <w:sz w:val="22"/>
+        </w:rPr>
+        <w:t>Lógica de Programação — SENAI | 14h</w:t>
+      </w:r>
+    </w:p>
+    <w:p>
+      <w:pPr>
+        <w:spacing w:lineRule="auto" w:line="276" w:before="0" w:after="20"/>
+        <w:ind w:left="283" w:hanging="283"/>
+        <w:jc w:val="left"/>
+      </w:pPr>
+      <w:r>
+        <w:rPr>
+          <w:rFonts w:ascii="Arial" w:hAnsi="Arial" w:cs="Arial"/>
+          <w:b w:val="0"/>
+          <w:i w:val="0"/>
+          <w:color w:val="333333"/>
+          <w:sz w:val="22"/>
+        </w:rPr>
+        <w:t>•</w:t>
+        <w:tab/>
+      </w:r>
+      <w:r>
+        <w:rPr>
+          <w:rFonts w:ascii="Arial" w:hAnsi="Arial" w:cs="Arial"/>
+          <w:b w:val="0"/>
+          <w:i w:val="0"/>
+          <w:color w:val="333333"/>
+          <w:sz w:val="22"/>
+        </w:rPr>
+        <w:t>Segurança Cibernética — SENAI | 4h</w:t>
+      </w:r>
+    </w:p>
+    <w:p>
+      <w:pPr>
+        <w:spacing w:lineRule="auto" w:line="276" w:before="0" w:after="20"/>
+        <w:ind w:left="283" w:hanging="283"/>
+        <w:jc w:val="left"/>
+      </w:pPr>
+      <w:r>
+        <w:rPr>
+          <w:rFonts w:ascii="Arial" w:hAnsi="Arial" w:cs="Arial"/>
+          <w:b w:val="0"/>
+          <w:i w:val="0"/>
+          <w:color w:val="333333"/>
+          <w:sz w:val="22"/>
+        </w:rPr>
+        <w:t>•</w:t>
+        <w:tab/>
+      </w:r>
+      <w:r>
+        <w:rPr>
+          <w:rFonts w:ascii="Arial" w:hAnsi="Arial" w:cs="Arial"/>
+          <w:b w:val="0"/>
+          <w:i w:val="0"/>
+          <w:color w:val="333333"/>
+          <w:sz w:val="22"/>
+        </w:rPr>
+        <w:t>Desvendando a Indústria 4.0 — SENAI | 20h</w:t>
+      </w:r>
+    </w:p>
+    <w:p>
+      <w:pPr>
+        <w:spacing w:lineRule="auto" w:line="276" w:before="0" w:after="20"/>
+        <w:ind w:left="283" w:hanging="283"/>
+        <w:jc w:val="left"/>
+      </w:pPr>
+      <w:r>
+        <w:rPr>
+          <w:rFonts w:ascii="Arial" w:hAnsi="Arial" w:cs="Arial"/>
+          <w:b w:val="0"/>
+          <w:i w:val="0"/>
+          <w:color w:val="333333"/>
+          <w:sz w:val="22"/>
+        </w:rPr>
+        <w:t>•</w:t>
+        <w:tab/>
+      </w:r>
+      <w:r>
+        <w:rPr>
+          <w:rFonts w:ascii="Arial" w:hAnsi="Arial" w:cs="Arial"/>
+          <w:b w:val="0"/>
+          <w:i w:val="0"/>
+          <w:color w:val="333333"/>
+          <w:sz w:val="22"/>
+        </w:rPr>
+        <w:t>Fundamentos da Inteligência Artificial — SENAI | 8h</w:t>
+      </w:r>
+    </w:p>
+    <w:p>
+      <w:pPr>
+        <w:spacing w:lineRule="auto" w:line="276" w:before="0" w:after="20"/>
+        <w:ind w:left="283" w:hanging="283"/>
+        <w:jc w:val="left"/>
+      </w:pPr>
+      <w:r>
+        <w:rPr>
+          <w:rFonts w:ascii="Arial" w:hAnsi="Arial" w:cs="Arial"/>
+          <w:b w:val="0"/>
+          <w:i w:val="0"/>
+          <w:color w:val="333333"/>
+          <w:sz w:val="22"/>
+        </w:rPr>
+        <w:t>•</w:t>
+        <w:tab/>
+      </w:r>
+      <w:r>
+        <w:rPr>
+          <w:rFonts w:ascii="Arial" w:hAnsi="Arial" w:cs="Arial"/>
+          <w:b w:val="0"/>
+          <w:i w:val="0"/>
+          <w:color w:val="333333"/>
+          <w:sz w:val="22"/>
+        </w:rPr>
+        <w:t>Ética na Inteligência Artificial — SENAI | 4h</w:t>
+      </w:r>
+    </w:p>
+    <w:p>
+      <w:pPr>
+        <w:spacing w:lineRule="auto" w:line="276" w:before="0" w:after="20"/>
+        <w:ind w:left="283" w:hanging="283"/>
+        <w:jc w:val="left"/>
+      </w:pPr>
+      <w:r>
+        <w:rPr>
+          <w:rFonts w:ascii="Arial" w:hAnsi="Arial" w:cs="Arial"/>
+          <w:b w:val="0"/>
+          <w:i w:val="0"/>
+          <w:color w:val="333333"/>
+          <w:sz w:val="22"/>
+        </w:rPr>
+        <w:t>•</w:t>
+        <w:tab/>
+      </w:r>
+      <w:r>
+        <w:rPr>
+          <w:rFonts w:ascii="Arial" w:hAnsi="Arial" w:cs="Arial"/>
+          <w:b w:val="0"/>
+          <w:i w:val="0"/>
+          <w:color w:val="333333"/>
+          <w:sz w:val="22"/>
+        </w:rPr>
+        <w:t>NR-11 — Operação de Empilhadeira — SENAI | 32h</w:t>
+      </w:r>
+    </w:p>
+    <w:p>
+      <w:pPr>
+        <w:spacing w:lineRule="auto" w:line="276" w:before="0" w:after="20"/>
+        <w:ind w:left="283" w:hanging="283"/>
+        <w:jc w:val="left"/>
+      </w:pPr>
+      <w:r>
+        <w:rPr>
+          <w:rFonts w:ascii="Arial" w:hAnsi="Arial" w:cs="Arial"/>
+          <w:b w:val="0"/>
+          <w:i w:val="0"/>
+          <w:color w:val="333333"/>
+          <w:sz w:val="22"/>
+        </w:rPr>
+        <w:t>•</w:t>
+        <w:tab/>
+      </w:r>
+      <w:r>
+        <w:rPr>
+          <w:rFonts w:ascii="Arial" w:hAnsi="Arial" w:cs="Arial"/>
+          <w:b w:val="0"/>
+          <w:i w:val="0"/>
+          <w:color w:val="333333"/>
+          <w:sz w:val="22"/>
+        </w:rPr>
+        <w:t>Reciclagens NR-11 — SuperFrio</w:t>
       </w:r>
     </w:p>
     <w:p>
@@ -981,13 +1597,13 @@
           <w:color w:val="333333"/>
           <w:sz w:val="22"/>
         </w:rPr>
-        <w:t>Metrologia Aplicada à Mecânica (60h) e PCP (40h) – SENAI (2024)</w:t>
+        <w:t>Caldeiraria Prática — AHCX Treinamentos / MJS Brasil | jan/2026 – jul/2026</w:t>
       </w:r>
     </w:p>
     <w:p>
       <w:pPr>
         <w:keepNext/>
-        <w:spacing w:lineRule="auto" w:line="276" w:before="160" w:after="100"/>
+        <w:spacing w:lineRule="auto" w:line="276" w:before="140" w:after="60"/>
         <w:jc w:val="left"/>
         <w:pBdr>
           <w:bottom w:val="single" w:sz="6" w:space="2" w:color="1B365D"/>
@@ -1001,12 +1617,192 @@
           <w:color w:val="1B365D"/>
           <w:sz w:val="28"/>
         </w:rPr>
-        <w:t>COMPETÊNCIAS</w:t>
+        <w:t>COMPETÊNCIAS TÉCNICAS</w:t>
       </w:r>
     </w:p>
     <w:p>
       <w:pPr>
-        <w:spacing w:lineRule="auto" w:line="276" w:before="0" w:after="40"/>
+        <w:spacing w:lineRule="auto" w:line="276" w:before="40" w:after="20"/>
+        <w:jc w:val="left"/>
+      </w:pPr>
+      <w:r>
+        <w:rPr>
+          <w:rFonts w:ascii="Arial" w:hAnsi="Arial" w:cs="Arial"/>
+          <w:b/>
+          <w:i w:val="0"/>
+          <w:color w:val="333333"/>
+          <w:sz w:val="22"/>
+        </w:rPr>
+        <w:t>Tecnologia, Dados e Automação:</w:t>
+      </w:r>
+    </w:p>
+    <w:p>
+      <w:pPr>
+        <w:spacing w:lineRule="auto" w:line="276" w:before="0" w:after="60"/>
+        <w:jc w:val="left"/>
+      </w:pPr>
+      <w:r>
+        <w:rPr>
+          <w:rFonts w:ascii="Arial" w:hAnsi="Arial" w:cs="Arial"/>
+          <w:b w:val="0"/>
+          <w:i w:val="0"/>
+          <w:color w:val="333333"/>
+          <w:sz w:val="22"/>
+        </w:rPr>
+        <w:t>Excel Avançado, Power BI, Power Automate, Power Apps, HTML, JavaScript, GitHub, GitHub Pages, Excel Online, Microsoft Forms, fundamentos de Python e desenvolvimento assistido por IA.</w:t>
+      </w:r>
+    </w:p>
+    <w:p>
+      <w:pPr>
+        <w:spacing w:lineRule="auto" w:line="276" w:before="0" w:after="20"/>
+        <w:jc w:val="left"/>
+      </w:pPr>
+      <w:r>
+        <w:rPr>
+          <w:rFonts w:ascii="Arial" w:hAnsi="Arial" w:cs="Arial"/>
+          <w:b/>
+          <w:i w:val="0"/>
+          <w:color w:val="333333"/>
+          <w:sz w:val="22"/>
+        </w:rPr>
+        <w:t>Sistemas Corporativos:</w:t>
+      </w:r>
+    </w:p>
+    <w:p>
+      <w:pPr>
+        <w:spacing w:lineRule="auto" w:line="276" w:before="0" w:after="60"/>
+        <w:jc w:val="left"/>
+      </w:pPr>
+      <w:r>
+        <w:rPr>
+          <w:rFonts w:ascii="Arial" w:hAnsi="Arial" w:cs="Arial"/>
+          <w:b w:val="0"/>
+          <w:i w:val="0"/>
+          <w:color w:val="333333"/>
+          <w:sz w:val="22"/>
+        </w:rPr>
+        <w:t>ServiceNow, Docnix, SAP, WMS Blue Yonder e ObraSoft.</w:t>
+      </w:r>
+    </w:p>
+    <w:p>
+      <w:pPr>
+        <w:spacing w:lineRule="auto" w:line="276" w:before="0" w:after="20"/>
+        <w:jc w:val="left"/>
+      </w:pPr>
+      <w:r>
+        <w:rPr>
+          <w:rFonts w:ascii="Arial" w:hAnsi="Arial" w:cs="Arial"/>
+          <w:b/>
+          <w:i w:val="0"/>
+          <w:color w:val="333333"/>
+          <w:sz w:val="22"/>
+        </w:rPr>
+        <w:t>Administração e Operações:</w:t>
+      </w:r>
+    </w:p>
+    <w:p>
+      <w:pPr>
+        <w:spacing w:lineRule="auto" w:line="276" w:before="0" w:after="60"/>
+        <w:jc w:val="left"/>
+      </w:pPr>
+      <w:r>
+        <w:rPr>
+          <w:rFonts w:ascii="Arial" w:hAnsi="Arial" w:cs="Arial"/>
+          <w:b w:val="0"/>
+          <w:i w:val="0"/>
+          <w:color w:val="333333"/>
+          <w:sz w:val="22"/>
+        </w:rPr>
+        <w:t>Governança documental, relatórios, indicadores, inventários, controle de materiais, gestão de EPIs, organização de almoxarifado, rotinas administrativas e suporte operacional.</w:t>
+      </w:r>
+    </w:p>
+    <w:p>
+      <w:pPr>
+        <w:spacing w:lineRule="auto" w:line="276" w:before="0" w:after="20"/>
+        <w:jc w:val="left"/>
+      </w:pPr>
+      <w:r>
+        <w:rPr>
+          <w:rFonts w:ascii="Arial" w:hAnsi="Arial" w:cs="Arial"/>
+          <w:b/>
+          <w:i w:val="0"/>
+          <w:color w:val="333333"/>
+          <w:sz w:val="22"/>
+        </w:rPr>
+        <w:t>Logística e Indústria:</w:t>
+      </w:r>
+    </w:p>
+    <w:p>
+      <w:pPr>
+        <w:spacing w:lineRule="auto" w:line="276" w:before="0" w:after="60"/>
+        <w:jc w:val="left"/>
+      </w:pPr>
+      <w:r>
+        <w:rPr>
+          <w:rFonts w:ascii="Arial" w:hAnsi="Arial" w:cs="Arial"/>
+          <w:b w:val="0"/>
+          <w:i w:val="0"/>
+          <w:color w:val="333333"/>
+          <w:sz w:val="22"/>
+        </w:rPr>
+        <w:t>Operação de empilhadeira, NR-11, expedição, armazenagem, picking, conferência, câmaras frias, PCP, metrologia, 5S, PDCA, Matriz GUT e gestão visual.</w:t>
+      </w:r>
+    </w:p>
+    <w:p>
+      <w:pPr>
+        <w:spacing w:lineRule="auto" w:line="276" w:before="0" w:after="20"/>
+        <w:jc w:val="left"/>
+      </w:pPr>
+      <w:r>
+        <w:rPr>
+          <w:rFonts w:ascii="Arial" w:hAnsi="Arial" w:cs="Arial"/>
+          <w:b/>
+          <w:i w:val="0"/>
+          <w:color w:val="333333"/>
+          <w:sz w:val="22"/>
+        </w:rPr>
+        <w:t>Competências Comportamentais:</w:t>
+      </w:r>
+    </w:p>
+    <w:p>
+      <w:pPr>
+        <w:spacing w:lineRule="auto" w:line="276" w:before="0" w:after="60"/>
+        <w:jc w:val="left"/>
+      </w:pPr>
+      <w:r>
+        <w:rPr>
+          <w:rFonts w:ascii="Arial" w:hAnsi="Arial" w:cs="Arial"/>
+          <w:b w:val="0"/>
+          <w:i w:val="0"/>
+          <w:color w:val="333333"/>
+          <w:sz w:val="22"/>
+        </w:rPr>
+        <w:t>Disciplina, responsabilidade, foco em resolução de problemas, aprendizado rápido, proatividade, resiliência, organização e mentalidade de melhoria contínua.</w:t>
+      </w:r>
+    </w:p>
+    <w:p>
+      <w:pPr>
+        <w:keepNext/>
+        <w:spacing w:lineRule="auto" w:line="276" w:before="140" w:after="60"/>
+        <w:jc w:val="left"/>
+        <w:pBdr>
+          <w:bottom w:val="single" w:sz="6" w:space="2" w:color="1B365D"/>
+        </w:pBdr>
+      </w:pPr>
+      <w:r>
+        <w:rPr>
+          <w:rFonts w:ascii="Arial" w:hAnsi="Arial" w:cs="Arial"/>
+          <w:b/>
+          <w:i w:val="0"/>
+          <w:color w:val="1B365D"/>
+          <w:sz w:val="28"/>
+        </w:rPr>
+        <w:t>INFORMAÇÕES ADICIONAIS</w:t>
+      </w:r>
+    </w:p>
+    <w:p>
+      <w:pPr>
+        <w:spacing w:lineRule="auto" w:line="276" w:before="0" w:after="20"/>
         <w:ind w:left="283" w:hanging="283"/>
         <w:jc w:val="left"/>
       </w:pPr>
@@ -1024,27 +1820,17 @@
       <w:r>
         <w:rPr>
           <w:rFonts w:ascii="Arial" w:hAnsi="Arial" w:cs="Arial"/>
-          <w:b/>
-          <w:i w:val="0"/>
-          <w:color w:val="333333"/>
-          <w:sz w:val="22"/>
-        </w:rPr>
-        <w:t xml:space="preserve">Dados e BI: </w:t>
-      </w:r>
-      <w:r>
-        <w:rPr>
-          <w:rFonts w:ascii="Arial" w:hAnsi="Arial" w:cs="Arial"/>
           <w:b w:val="0"/>
           <w:i w:val="0"/>
           <w:color w:val="333333"/>
           <w:sz w:val="22"/>
         </w:rPr>
-        <w:t>Excel Avançado (dashboards, tabelas dinâmicas, KPIs), Power BI e Microsoft Forms</w:t>
+        <w:t>CNH categorias A e B, com EAR.</w:t>
       </w:r>
     </w:p>
     <w:p>
       <w:pPr>
-        <w:spacing w:lineRule="auto" w:line="276" w:before="0" w:after="40"/>
+        <w:spacing w:lineRule="auto" w:line="276" w:before="0" w:after="20"/>
         <w:ind w:left="283" w:hanging="283"/>
         <w:jc w:val="left"/>
       </w:pPr>
@@ -1062,27 +1848,17 @@
       <w:r>
         <w:rPr>
           <w:rFonts w:ascii="Arial" w:hAnsi="Arial" w:cs="Arial"/>
-          <w:b/>
-          <w:i w:val="0"/>
-          <w:color w:val="333333"/>
-          <w:sz w:val="22"/>
-        </w:rPr>
-        <w:t xml:space="preserve">Automação e desenvolvimento: </w:t>
-      </w:r>
-      <w:r>
-        <w:rPr>
-          <w:rFonts w:ascii="Arial" w:hAnsi="Arial" w:cs="Arial"/>
           <w:b w:val="0"/>
           <w:i w:val="0"/>
           <w:color w:val="333333"/>
           <w:sz w:val="22"/>
         </w:rPr>
-        <w:t>Power Automate, Power Apps, HTML/JavaScript, GitHub, fundamentos de Python e desenvolvimento assistido por IA (especificação, revisão e iteração de código)</w:t>
+        <w:t>Disponibilidade para início imediato.</w:t>
       </w:r>
     </w:p>
     <w:p>
       <w:pPr>
-        <w:spacing w:lineRule="auto" w:line="276" w:before="0" w:after="40"/>
+        <w:spacing w:lineRule="auto" w:line="276" w:before="0" w:after="20"/>
         <w:ind w:left="283" w:hanging="283"/>
         <w:jc w:val="left"/>
       </w:pPr>
@@ -1100,156 +1876,12 @@
       <w:r>
         <w:rPr>
           <w:rFonts w:ascii="Arial" w:hAnsi="Arial" w:cs="Arial"/>
-          <w:b/>
-          <w:i w:val="0"/>
-          <w:color w:val="333333"/>
-          <w:sz w:val="22"/>
-        </w:rPr>
-        <w:t xml:space="preserve">Sistemas corporativos: </w:t>
-      </w:r>
-      <w:r>
-        <w:rPr>
-          <w:rFonts w:ascii="Arial" w:hAnsi="Arial" w:cs="Arial"/>
           <w:b w:val="0"/>
           <w:i w:val="0"/>
           <w:color w:val="333333"/>
           <w:sz w:val="22"/>
         </w:rPr>
-        <w:t>SAP (consultas), ServiceNow, Docnix e WMS Blue Yonder</w:t>
-      </w:r>
-    </w:p>
-    <w:p>
-      <w:pPr>
-        <w:spacing w:lineRule="auto" w:line="276" w:before="0" w:after="40"/>
-        <w:ind w:left="283" w:hanging="283"/>
-        <w:jc w:val="left"/>
-      </w:pPr>
-      <w:r>
-        <w:rPr>
-          <w:rFonts w:ascii="Arial" w:hAnsi="Arial" w:cs="Arial"/>
-          <w:b w:val="0"/>
-          <w:i w:val="0"/>
-          <w:color w:val="333333"/>
-          <w:sz w:val="22"/>
-        </w:rPr>
-        <w:t>•</w:t>
-        <w:tab/>
-      </w:r>
-      <w:r>
-        <w:rPr>
-          <w:rFonts w:ascii="Arial" w:hAnsi="Arial" w:cs="Arial"/>
-          <w:b/>
-          <w:i w:val="0"/>
-          <w:color w:val="333333"/>
-          <w:sz w:val="22"/>
-        </w:rPr>
-        <w:t xml:space="preserve">Melhoria contínua: </w:t>
-      </w:r>
-      <w:r>
-        <w:rPr>
-          <w:rFonts w:ascii="Arial" w:hAnsi="Arial" w:cs="Arial"/>
-          <w:b w:val="0"/>
-          <w:i w:val="0"/>
-          <w:color w:val="333333"/>
-          <w:sz w:val="22"/>
-        </w:rPr>
-        <w:t>5S, PDCA, Matriz GUT, gestão visual e noções de Scrum</w:t>
-      </w:r>
-    </w:p>
-    <w:p>
-      <w:pPr>
-        <w:spacing w:lineRule="auto" w:line="276" w:before="0" w:after="40"/>
-        <w:ind w:left="283" w:hanging="283"/>
-        <w:jc w:val="left"/>
-      </w:pPr>
-      <w:r>
-        <w:rPr>
-          <w:rFonts w:ascii="Arial" w:hAnsi="Arial" w:cs="Arial"/>
-          <w:b w:val="0"/>
-          <w:i w:val="0"/>
-          <w:color w:val="333333"/>
-          <w:sz w:val="22"/>
-        </w:rPr>
-        <w:t>•</w:t>
-        <w:tab/>
-      </w:r>
-      <w:r>
-        <w:rPr>
-          <w:rFonts w:ascii="Arial" w:hAnsi="Arial" w:cs="Arial"/>
-          <w:b/>
-          <w:i w:val="0"/>
-          <w:color w:val="333333"/>
-          <w:sz w:val="22"/>
-        </w:rPr>
-        <w:t xml:space="preserve">Logística e indústria: </w:t>
-      </w:r>
-      <w:r>
-        <w:rPr>
-          <w:rFonts w:ascii="Arial" w:hAnsi="Arial" w:cs="Arial"/>
-          <w:b w:val="0"/>
-          <w:i w:val="0"/>
-          <w:color w:val="333333"/>
-          <w:sz w:val="22"/>
-        </w:rPr>
-        <w:t>operação de empilhadeira (NR-11), inventários, PCP e metrologia</w:t>
-      </w:r>
-    </w:p>
-    <w:p>
-      <w:pPr>
-        <w:spacing w:lineRule="auto" w:line="276" w:before="0" w:after="60"/>
-        <w:ind w:left="283" w:hanging="283"/>
-        <w:jc w:val="left"/>
-      </w:pPr>
-      <w:r>
-        <w:rPr>
-          <w:rFonts w:ascii="Arial" w:hAnsi="Arial" w:cs="Arial"/>
-          <w:b w:val="0"/>
-          <w:i w:val="0"/>
-          <w:color w:val="333333"/>
-          <w:sz w:val="22"/>
-        </w:rPr>
-        <w:t>•</w:t>
-        <w:tab/>
-      </w:r>
-      <w:r>
-        <w:rPr>
-          <w:rFonts w:ascii="Arial" w:hAnsi="Arial" w:cs="Arial"/>
-          <w:b/>
-          <w:i w:val="0"/>
-          <w:color w:val="333333"/>
-          <w:sz w:val="22"/>
-        </w:rPr>
-        <w:t xml:space="preserve">Comportamentais: </w:t>
-      </w:r>
-      <w:r>
-        <w:rPr>
-          <w:rFonts w:ascii="Arial" w:hAnsi="Arial" w:cs="Arial"/>
-          <w:b w:val="0"/>
-          <w:i w:val="0"/>
-          <w:color w:val="333333"/>
-          <w:sz w:val="22"/>
-        </w:rPr>
-        <w:t>disciplina, autodidatismo, resiliência e foco em resolução de problemas</w:t>
-      </w:r>
-    </w:p>
-    <w:p>
-      <w:pPr>
-        <w:keepNext/>
-        <w:spacing w:lineRule="auto" w:line="276" w:before="160" w:after="100"/>
-        <w:jc w:val="left"/>
-        <w:pBdr>
-          <w:bottom w:val="single" w:sz="6" w:space="2" w:color="1B365D"/>
-        </w:pBdr>
-      </w:pPr>
-      <w:r>
-        <w:rPr>
-          <w:rFonts w:ascii="Arial" w:hAnsi="Arial" w:cs="Arial"/>
-          <w:b/>
-          <w:i w:val="0"/>
-          <w:color w:val="1B365D"/>
-          <w:sz w:val="28"/>
-        </w:rPr>
-        <w:t>INFORMAÇÕES ADICIONAIS</w:t>
+        <w:t>Disponibilidade para turnos ou horário comercial.</w:t>
       </w:r>
     </w:p>
     <w:p>
@@ -1277,7 +1909,7 @@
           <w:color w:val="333333"/>
           <w:sz w:val="22"/>
         </w:rPr>
-        <w:t>CNH categorias A e B (EAR); disponibilidade para início imediato e para trabalho em turnos</w:t>
+        <w:t>Interesse em oportunidades nas áreas de suporte de TI, administração, BI, logística, operações, manutenção, melhoria de processos e tecnologia.</w:t>
       </w:r>
     </w:p>
     <w:sectPr>

</xml_diff>

<commit_message>
Troca resumo por versão focada em operações e reforça cargo da CBA
Resumo profissional substituído por redação voltada a vaga operacional/
industrial (sem ênfase em transição para TI). Cargo na CBA atualizado
para "Aprendiz Técnico em Administração – Suporte de Operações
Industriais".

Co-Authored-By: Claude Fable 5 <noreply@anthropic.com>
Claude-Session: https://claude.ai/code/session_019HdFRyXgvzwcnxRxeQH7i9
</commit_message>
<xml_diff>
--- a/Curriculo_Jeferson_dos_Santos_Cardoso.docx
+++ b/Curriculo_Jeferson_dos_Santos_Cardoso.docx
@@ -99,39 +99,7 @@
           <w:color w:val="333333"/>
           <w:sz w:val="22"/>
         </w:rPr>
-        <w:t>Profissional técnico em transição para Tecnologia da Informação, com formação pelo SENAI em Eletromecânica e Administração, aprovado no Tecnólogo em Análise e Desenvolvimento de Sistemas pela Facens. Experiência em ambiente industrial, logística refrigerada, suporte operacional, governança documental, indicadores, inventários, sistemas corporativos e melhoria de processos.</w:t>
-      </w:r>
-    </w:p>
-    <w:p>
-      <w:pPr>
-        <w:spacing w:lineRule="auto" w:line="276" w:before="0" w:after="60"/>
-        <w:jc w:val="left"/>
-      </w:pPr>
-      <w:r>
-        <w:rPr>
-          <w:rFonts w:ascii="Arial" w:hAnsi="Arial" w:cs="Arial"/>
-          <w:b w:val="0"/>
-          <w:i w:val="0"/>
-          <w:color w:val="333333"/>
-          <w:sz w:val="22"/>
-        </w:rPr>
-        <w:t>Atuação na CBA com Docnix, ServiceNow, Power BI, Power Apps/ObraSoft, SAP, Excel e suporte técnico local, contribuindo para organização documental, controle de indicadores, gestão de materiais e digitalização de rotinas operacionais. Desenvolvi e testei em piloto um sistema web/PWA para gestão de ocorrências de fornos industriais, integrando Power Automate, Excel Online, GitHub e Cloudflare.</w:t>
-      </w:r>
-    </w:p>
-    <w:p>
-      <w:pPr>
-        <w:spacing w:lineRule="auto" w:line="276" w:before="0" w:after="60"/>
-        <w:jc w:val="left"/>
-      </w:pPr>
-      <w:r>
-        <w:rPr>
-          <w:rFonts w:ascii="Arial" w:hAnsi="Arial" w:cs="Arial"/>
-          <w:b w:val="0"/>
-          <w:i w:val="0"/>
-          <w:color w:val="333333"/>
-          <w:sz w:val="22"/>
-        </w:rPr>
-        <w:t>Perfil disciplinado, hands-on e autodidata, com facilidade para aprender ferramentas, resolver problemas práticos e transformar controles manuais em soluções mais organizadas, rastreáveis e eficientes.</w:t>
+        <w:t>Profissional com formação técnica em Eletromecânica e Administração pelo SENAI, com experiência em ambiente industrial, logística, operação, organização de processos, registros, indicadores e melhoria contínua. Atuação na CBA com suporte às rotinas operacionais da Sala de Fornos 7, governança documental, acompanhamento de indicadores, controle de almoxarifado, SAP, Power BI, Power Apps, 5S e apoio à padronização de processos. Experiência anterior como Operador de Armazém Júnior e Pleno, com operação de empilhadeira, WMS, expedição, carregamento e trabalho em ambiente de alto giro. Perfil disciplinado, responsável, hands-on e com facilidade para aprender procedimentos, cumprir normas de segurança, qualidade e produtividade.</w:t>
       </w:r>
     </w:p>
     <w:p>
@@ -193,7 +161,7 @@
           <w:color w:val="333333"/>
           <w:sz w:val="22"/>
         </w:rPr>
-        <w:t>Aprendiz – Suporte de Operações / Administrativo Técnico — Sala de Fornos 7</w:t>
+        <w:t>Aprendiz Técnico em Administração – Suporte de Operações Industriais — Sala de Fornos 7</w:t>
       </w:r>
     </w:p>
     <w:p>

</xml_diff>

<commit_message>
Consolida versão única 10/10 em 2 páginas exatas
Funde o resumo operacional (com Facens e sistema autoral reintegrados) ao
conteúdo completo aprovado: remove bullet genérico da CBA, condensa
cursos e informações adicionais, encurta quebras de linha desperdiçadas
e compacta espaçamentos. Currículo único que atende vagas de operações e
de tecnologia no padrão de 2 páginas.

Co-Authored-By: Claude Fable 5 <noreply@anthropic.com>
Claude-Session: https://claude.ai/code/session_019HdFRyXgvzwcnxRxeQH7i9
</commit_message>
<xml_diff>
--- a/Curriculo_Jeferson_dos_Santos_Cardoso.docx
+++ b/Curriculo_Jeferson_dos_Santos_Cardoso.docx
@@ -69,7 +69,7 @@
     <w:p>
       <w:pPr>
         <w:keepNext/>
-        <w:spacing w:lineRule="auto" w:line="276" w:before="160" w:after="60"/>
+        <w:spacing w:lineRule="auto" w:line="276" w:before="120" w:after="80"/>
         <w:jc w:val="left"/>
         <w:pBdr>
           <w:bottom w:val="single" w:sz="6" w:space="2" w:color="1B365D"/>
@@ -99,13 +99,13 @@
           <w:color w:val="333333"/>
           <w:sz w:val="22"/>
         </w:rPr>
-        <w:t>Profissional com formação técnica em Eletromecânica e Administração pelo SENAI, com experiência em ambiente industrial, logística, operação, organização de processos, registros, indicadores e melhoria contínua. Atuação na CBA com suporte às rotinas operacionais da Sala de Fornos 7, governança documental, acompanhamento de indicadores, controle de almoxarifado, SAP, Power BI, Power Apps, 5S e apoio à padronização de processos. Experiência anterior como Operador de Armazém Júnior e Pleno, com operação de empilhadeira, WMS, expedição, carregamento e trabalho em ambiente de alto giro. Perfil disciplinado, responsável, hands-on e com facilidade para aprender procedimentos, cumprir normas de segurança, qualidade e produtividade.</w:t>
+        <w:t>Profissional com formação técnica em Eletromecânica e Administração pelo SENAI, aprovado no Tecnólogo em Análise e Desenvolvimento de Sistemas (Facens), com experiência em ambiente industrial, logística, operação, organização de processos, registros, indicadores e melhoria contínua. Atuação na CBA com suporte às rotinas operacionais da Sala de Fornos 7, governança documental, acompanhamento de indicadores, controle de almoxarifado, SAP, Power BI, Power Apps e 5S — além do desenvolvimento autoral de um sistema web de gestão de ocorrências, testado em piloto no setor. Experiência anterior como Operador de Armazém Júnior e Pleno, com operação de empilhadeira, WMS, expedição e carregamento em ambiente de alto giro. Perfil disciplinado, responsável, hands-on e com facilidade para aprender procedimentos e cumprir normas de segurança, qualidade e produtividade.</w:t>
       </w:r>
     </w:p>
     <w:p>
       <w:pPr>
         <w:keepNext/>
-        <w:spacing w:lineRule="auto" w:line="276" w:before="140" w:after="60"/>
+        <w:spacing w:lineRule="auto" w:line="276" w:before="140" w:after="80"/>
         <w:jc w:val="left"/>
         <w:pBdr>
           <w:bottom w:val="single" w:sz="6" w:space="2" w:color="1B365D"/>
@@ -124,7 +124,7 @@
     </w:p>
     <w:p>
       <w:pPr>
-        <w:spacing w:lineRule="auto" w:line="276" w:before="40" w:after="20"/>
+        <w:spacing w:lineRule="auto" w:line="276" w:before="20" w:after="20"/>
         <w:jc w:val="left"/>
       </w:pPr>
       <w:r>
@@ -150,7 +150,7 @@
     </w:p>
     <w:p>
       <w:pPr>
-        <w:spacing w:lineRule="auto" w:line="276" w:before="0" w:after="20"/>
+        <w:spacing w:lineRule="auto" w:line="276" w:before="0" w:after="40"/>
         <w:jc w:val="left"/>
       </w:pPr>
       <w:r>
@@ -163,12 +163,16 @@
         </w:rPr>
         <w:t>Aprendiz Técnico em Administração – Suporte de Operações Industriais — Sala de Fornos 7</w:t>
       </w:r>
-    </w:p>
-    <w:p>
-      <w:pPr>
-        <w:spacing w:lineRule="auto" w:line="276" w:before="0" w:after="40"/>
-        <w:jc w:val="left"/>
-      </w:pPr>
+      <w:r>
+        <w:rPr>
+          <w:rFonts w:ascii="Arial" w:hAnsi="Arial" w:cs="Arial"/>
+          <w:b w:val="0"/>
+          <w:i w:val="0"/>
+          <w:color w:val="333333"/>
+          <w:sz w:val="22"/>
+        </w:rPr>
+        <w:t xml:space="preserve">  |  </w:t>
+      </w:r>
       <w:r>
         <w:rPr>
           <w:rFonts w:ascii="Arial" w:hAnsi="Arial" w:cs="Arial"/>
@@ -205,7 +209,7 @@
           <w:color w:val="333333"/>
           <w:sz w:val="22"/>
         </w:rPr>
-        <w:t>Atuação em suporte administrativo e operacional na Sala de Fornos 7, apoiando rotinas de produção, segurança, manutenção, documentação, indicadores e controle de materiais.</w:t>
+        <w:t>Gestão e governança documental no Docnix: pesquisa avançada, verificação de vigência e distribuição de Procedimentos Operacionais, Padrões de Trabalho e FMEAs.</w:t>
       </w:r>
     </w:p>
     <w:p>
@@ -233,7 +237,7 @@
           <w:color w:val="333333"/>
           <w:sz w:val="22"/>
         </w:rPr>
-        <w:t>Gestão e governança documental no Docnix, com pesquisa avançada, verificação de vigência, organização e distribuição de Procedimentos Operacionais, Padrões de Trabalho e FMEAs.</w:t>
+        <w:t>Apoio local de TI/Key User: chamados no ServiceNow, suporte a acessos, impressoras e equipamentos bloqueados por BitLocker.</w:t>
       </w:r>
     </w:p>
     <w:p>
@@ -261,7 +265,7 @@
           <w:color w:val="333333"/>
           <w:sz w:val="22"/>
         </w:rPr>
-        <w:t>Atuação como apoio local de TI/Key User, com abertura e acompanhamento de chamados no ServiceNow, suporte a acessos, impressoras, equipamentos bloqueados por BitLocker e demandas técnicas do setor.</w:t>
+        <w:t>Monitoramento diário de indicadores de segurança e operação (DDS, abrangências e pendências) em Power BI, Power Apps e ObraSoft.</w:t>
       </w:r>
     </w:p>
     <w:p>
@@ -289,12 +293,12 @@
           <w:color w:val="333333"/>
           <w:sz w:val="22"/>
         </w:rPr>
-        <w:t>Monitoramento diário de indicadores de segurança e operação, incluindo DDS, abrangências, pendências e registros em Power BI, Power Apps e ObraSoft.</w:t>
+        <w:t>Planilhas de controle em Excel para inventários, entrada e saída de materiais e distribuição de EPIs, com consultas de saldo no SAP e organização do almoxarifado com 5S.</w:t>
       </w:r>
     </w:p>
     <w:p>
       <w:pPr>
-        <w:spacing w:lineRule="auto" w:line="276" w:before="0" w:after="20"/>
+        <w:spacing w:lineRule="auto" w:line="276" w:before="0" w:after="80"/>
         <w:ind w:left="283" w:hanging="283"/>
         <w:jc w:val="left"/>
       </w:pPr>
@@ -317,91 +321,7 @@
           <w:color w:val="333333"/>
           <w:sz w:val="22"/>
         </w:rPr>
-        <w:t>Elaboração e atualização de planilhas de controle em Excel, apoiando inventários, entrada e saída de materiais, distribuição de EPIs e consultas de saldo no SAP.</w:t>
-      </w:r>
-    </w:p>
-    <w:p>
-      <w:pPr>
-        <w:spacing w:lineRule="auto" w:line="276" w:before="0" w:after="20"/>
-        <w:ind w:left="283" w:hanging="283"/>
-        <w:jc w:val="left"/>
-      </w:pPr>
-      <w:r>
-        <w:rPr>
-          <w:rFonts w:ascii="Arial" w:hAnsi="Arial" w:cs="Arial"/>
-          <w:b w:val="0"/>
-          <w:i w:val="0"/>
-          <w:color w:val="333333"/>
-          <w:sz w:val="22"/>
-        </w:rPr>
-        <w:t>•</w:t>
-        <w:tab/>
-      </w:r>
-      <w:r>
-        <w:rPr>
-          <w:rFonts w:ascii="Arial" w:hAnsi="Arial" w:cs="Arial"/>
-          <w:b w:val="0"/>
-          <w:i w:val="0"/>
-          <w:color w:val="333333"/>
-          <w:sz w:val="22"/>
-        </w:rPr>
-        <w:t>Organização do almoxarifado do setor com aplicação de boas práticas de controle, 5S, rastreabilidade de materiais e padronização de registros.</w:t>
-      </w:r>
-    </w:p>
-    <w:p>
-      <w:pPr>
-        <w:spacing w:lineRule="auto" w:line="276" w:before="0" w:after="20"/>
-        <w:ind w:left="283" w:hanging="283"/>
-        <w:jc w:val="left"/>
-      </w:pPr>
-      <w:r>
-        <w:rPr>
-          <w:rFonts w:ascii="Arial" w:hAnsi="Arial" w:cs="Arial"/>
-          <w:b w:val="0"/>
-          <w:i w:val="0"/>
-          <w:color w:val="333333"/>
-          <w:sz w:val="22"/>
-        </w:rPr>
-        <w:t>•</w:t>
-        <w:tab/>
-      </w:r>
-      <w:r>
-        <w:rPr>
-          <w:rFonts w:ascii="Arial" w:hAnsi="Arial" w:cs="Arial"/>
-          <w:b w:val="0"/>
-          <w:i w:val="0"/>
-          <w:color w:val="333333"/>
-          <w:sz w:val="22"/>
-        </w:rPr>
-        <w:t>Identificação de falhas em controles manuais e criação de soluções digitais para aumentar rastreabilidade, reduzir perda de informação e melhorar a tomada de decisão.</w:t>
-      </w:r>
-    </w:p>
-    <w:p>
-      <w:pPr>
-        <w:spacing w:lineRule="auto" w:line="276" w:before="0" w:after="60"/>
-        <w:ind w:left="283" w:hanging="283"/>
-        <w:jc w:val="left"/>
-      </w:pPr>
-      <w:r>
-        <w:rPr>
-          <w:rFonts w:ascii="Arial" w:hAnsi="Arial" w:cs="Arial"/>
-          <w:b w:val="0"/>
-          <w:i w:val="0"/>
-          <w:color w:val="333333"/>
-          <w:sz w:val="22"/>
-        </w:rPr>
-        <w:t>•</w:t>
-        <w:tab/>
-      </w:r>
-      <w:r>
-        <w:rPr>
-          <w:rFonts w:ascii="Arial" w:hAnsi="Arial" w:cs="Arial"/>
-          <w:b w:val="0"/>
-          <w:i w:val="0"/>
-          <w:color w:val="333333"/>
-          <w:sz w:val="22"/>
-        </w:rPr>
-        <w:t>Desenvolvimento de checklists e controles digitais que evoluíram para um sistema web de gestão de ocorrências industriais, testado em piloto na área.</w:t>
+        <w:t>Identificação de falhas em controles manuais e criação de checklists e controles digitais que evoluíram para um sistema web de gestão de ocorrências, testado em piloto na área.</w:t>
       </w:r>
     </w:p>
     <w:p>
@@ -432,7 +352,7 @@
     </w:p>
     <w:p>
       <w:pPr>
-        <w:spacing w:lineRule="auto" w:line="276" w:before="0" w:after="20"/>
+        <w:spacing w:lineRule="auto" w:line="276" w:before="0" w:after="40"/>
         <w:jc w:val="left"/>
       </w:pPr>
       <w:r>
@@ -445,12 +365,16 @@
         </w:rPr>
         <w:t>Operador de Armazém Júnior → Pleno</w:t>
       </w:r>
-    </w:p>
-    <w:p>
-      <w:pPr>
-        <w:spacing w:lineRule="auto" w:line="276" w:before="0" w:after="40"/>
-        <w:jc w:val="left"/>
-      </w:pPr>
+      <w:r>
+        <w:rPr>
+          <w:rFonts w:ascii="Arial" w:hAnsi="Arial" w:cs="Arial"/>
+          <w:b w:val="0"/>
+          <w:i w:val="0"/>
+          <w:color w:val="333333"/>
+          <w:sz w:val="22"/>
+        </w:rPr>
+        <w:t xml:space="preserve">  |  </w:t>
+      </w:r>
       <w:r>
         <w:rPr>
           <w:rFonts w:ascii="Arial" w:hAnsi="Arial" w:cs="Arial"/>
@@ -487,7 +411,7 @@
           <w:color w:val="333333"/>
           <w:sz w:val="22"/>
         </w:rPr>
-        <w:t>Promovido de Operador Júnior a Pleno em menos de 12 meses, em reconhecimento ao desempenho, confiabilidade, produtividade e adaptação à rotina operacional.</w:t>
+        <w:t>Promovido de Operador Júnior a Pleno em menos de 12 meses, em reconhecimento ao desempenho, confiabilidade e produtividade.</w:t>
       </w:r>
     </w:p>
     <w:p>
@@ -515,7 +439,7 @@
           <w:color w:val="333333"/>
           <w:sz w:val="22"/>
         </w:rPr>
-        <w:t>Operação de empilhadeiras, conforme NR-11, em ambiente refrigerado de alta demanda, com movimentação, separação, organização e expedição de cargas.</w:t>
+        <w:t>Operação de empilhadeiras (NR-11) em câmaras frias de até -25 °C, com picking, conferência, armazenagem e carregamento em turno noturno de alta demanda.</w:t>
       </w:r>
     </w:p>
     <w:p>
@@ -543,12 +467,12 @@
           <w:color w:val="333333"/>
           <w:sz w:val="22"/>
         </w:rPr>
-        <w:t>Atuação em câmaras frias de até -25 °C, realizando picking, conferência, armazenagem, carregamento e suporte à operação logística em turno noturno.</w:t>
+        <w:t>Utilização de coletor de dados e WMS Blue Yonder para controle de movimentações, separação de pedidos e apoio ao fluxo de estoque.</w:t>
       </w:r>
     </w:p>
     <w:p>
       <w:pPr>
-        <w:spacing w:lineRule="auto" w:line="276" w:before="0" w:after="20"/>
+        <w:spacing w:lineRule="auto" w:line="276" w:before="0" w:after="80"/>
         <w:ind w:left="283" w:hanging="283"/>
         <w:jc w:val="left"/>
       </w:pPr>
@@ -571,63 +495,7 @@
           <w:color w:val="333333"/>
           <w:sz w:val="22"/>
         </w:rPr>
-        <w:t>Utilização de coletor de dados e sistema WMS Blue Yonder para controle de movimentações, separação de pedidos, localização de produtos e apoio ao fluxo de estoque.</w:t>
-      </w:r>
-    </w:p>
-    <w:p>
-      <w:pPr>
-        <w:spacing w:lineRule="auto" w:line="276" w:before="0" w:after="20"/>
-        <w:ind w:left="283" w:hanging="283"/>
-        <w:jc w:val="left"/>
-      </w:pPr>
-      <w:r>
-        <w:rPr>
-          <w:rFonts w:ascii="Arial" w:hAnsi="Arial" w:cs="Arial"/>
-          <w:b w:val="0"/>
-          <w:i w:val="0"/>
-          <w:color w:val="333333"/>
-          <w:sz w:val="22"/>
-        </w:rPr>
-        <w:t>•</w:t>
-        <w:tab/>
-      </w:r>
-      <w:r>
-        <w:rPr>
-          <w:rFonts w:ascii="Arial" w:hAnsi="Arial" w:cs="Arial"/>
-          <w:b w:val="0"/>
-          <w:i w:val="0"/>
-          <w:color w:val="333333"/>
-          <w:sz w:val="22"/>
-        </w:rPr>
-        <w:t>Apoio à organização do armazém, controle de produtividade, segurança operacional e cumprimento de procedimentos internos.</w:t>
-      </w:r>
-    </w:p>
-    <w:p>
-      <w:pPr>
-        <w:spacing w:lineRule="auto" w:line="276" w:before="0" w:after="60"/>
-        <w:ind w:left="283" w:hanging="283"/>
-        <w:jc w:val="left"/>
-      </w:pPr>
-      <w:r>
-        <w:rPr>
-          <w:rFonts w:ascii="Arial" w:hAnsi="Arial" w:cs="Arial"/>
-          <w:b w:val="0"/>
-          <w:i w:val="0"/>
-          <w:color w:val="333333"/>
-          <w:sz w:val="22"/>
-        </w:rPr>
-        <w:t>•</w:t>
-        <w:tab/>
-      </w:r>
-      <w:r>
-        <w:rPr>
-          <w:rFonts w:ascii="Arial" w:hAnsi="Arial" w:cs="Arial"/>
-          <w:b w:val="0"/>
-          <w:i w:val="0"/>
-          <w:color w:val="333333"/>
-          <w:sz w:val="22"/>
-        </w:rPr>
-        <w:t>Capacitação contínua em paralelo ao trabalho, com cursos em Excel Avançado, Power BI, Fundamentos de Python, PCP e Metrologia.</w:t>
+        <w:t>Capacitação contínua em paralelo ao trabalho: Excel Avançado, Power BI, Fundamentos de Python, PCP e Metrologia.</w:t>
       </w:r>
     </w:p>
     <w:p>
@@ -658,7 +526,7 @@
     </w:p>
     <w:p>
       <w:pPr>
-        <w:spacing w:lineRule="auto" w:line="276" w:before="0" w:after="20"/>
+        <w:spacing w:lineRule="auto" w:line="276" w:before="0" w:after="40"/>
         <w:jc w:val="left"/>
       </w:pPr>
       <w:r>
@@ -671,12 +539,16 @@
         </w:rPr>
         <w:t>Ajudante Operacional</w:t>
       </w:r>
-    </w:p>
-    <w:p>
-      <w:pPr>
-        <w:spacing w:lineRule="auto" w:line="276" w:before="0" w:after="40"/>
-        <w:jc w:val="left"/>
-      </w:pPr>
+      <w:r>
+        <w:rPr>
+          <w:rFonts w:ascii="Arial" w:hAnsi="Arial" w:cs="Arial"/>
+          <w:b w:val="0"/>
+          <w:i w:val="0"/>
+          <w:color w:val="333333"/>
+          <w:sz w:val="22"/>
+        </w:rPr>
+        <w:t xml:space="preserve">  |  </w:t>
+      </w:r>
       <w:r>
         <w:rPr>
           <w:rFonts w:ascii="Arial" w:hAnsi="Arial" w:cs="Arial"/>
@@ -686,34 +558,6 @@
           <w:sz w:val="22"/>
         </w:rPr>
         <w:t>ago/2021 – jul/2022</w:t>
-      </w:r>
-    </w:p>
-    <w:p>
-      <w:pPr>
-        <w:spacing w:lineRule="auto" w:line="276" w:before="0" w:after="20"/>
-        <w:ind w:left="283" w:hanging="283"/>
-        <w:jc w:val="left"/>
-      </w:pPr>
-      <w:r>
-        <w:rPr>
-          <w:rFonts w:ascii="Arial" w:hAnsi="Arial" w:cs="Arial"/>
-          <w:b w:val="0"/>
-          <w:i w:val="0"/>
-          <w:color w:val="333333"/>
-          <w:sz w:val="22"/>
-        </w:rPr>
-        <w:t>•</w:t>
-        <w:tab/>
-      </w:r>
-      <w:r>
-        <w:rPr>
-          <w:rFonts w:ascii="Arial" w:hAnsi="Arial" w:cs="Arial"/>
-          <w:b w:val="0"/>
-          <w:i w:val="0"/>
-          <w:color w:val="333333"/>
-          <w:sz w:val="22"/>
-        </w:rPr>
-        <w:t>Apoio às rotinas de centro de distribuição, incluindo carregamento de caminhões, paletização, organização de estoque, movimentação de mercadorias e separação de cargas.</w:t>
       </w:r>
     </w:p>
     <w:p>
@@ -741,13 +585,13 @@
           <w:color w:val="333333"/>
           <w:sz w:val="22"/>
         </w:rPr>
-        <w:t>Controle de devolução de ativos, como caixas e materiais retornáveis, auxiliando na organização e fluxo operacional do setor.</w:t>
+        <w:t>Carregamento de caminhões, paletização, organização de estoque, separação de cargas e devolução de ativos retornáveis.</w:t>
       </w:r>
     </w:p>
     <w:p>
       <w:pPr>
         <w:keepNext/>
-        <w:spacing w:lineRule="auto" w:line="276" w:before="140" w:after="60"/>
+        <w:spacing w:lineRule="auto" w:line="276" w:before="140" w:after="80"/>
         <w:jc w:val="left"/>
         <w:pBdr>
           <w:bottom w:val="single" w:sz="6" w:space="2" w:color="1B365D"/>
@@ -766,7 +610,7 @@
     </w:p>
     <w:p>
       <w:pPr>
-        <w:spacing w:lineRule="auto" w:line="276" w:before="40" w:after="40"/>
+        <w:spacing w:lineRule="auto" w:line="276" w:before="20" w:after="40"/>
         <w:jc w:val="left"/>
       </w:pPr>
       <w:r>
@@ -805,7 +649,7 @@
           <w:color w:val="333333"/>
           <w:sz w:val="22"/>
         </w:rPr>
-        <w:t>Identificação de uma dor real da operação: controles manuais em lousa, baixa rastreabilidade, ausência de histórico estruturado e dificuldade para análise de recorrências.</w:t>
+        <w:t>Dor real identificada na operação: controles manuais em lousa, baixa rastreabilidade e ausência de histórico estruturado para análise de recorrências.</w:t>
       </w:r>
     </w:p>
     <w:p>
@@ -833,7 +677,7 @@
           <w:color w:val="333333"/>
           <w:sz w:val="22"/>
         </w:rPr>
-        <w:t>Desenvolvimento de uma aplicação web PWA para registrar ocorrências, acompanhar histórico, visualizar fornos críticos, gerar rankings, aplicar análise de Pareto e apoiar decisões operacionais.</w:t>
+        <w:t>Desenvolvimento de aplicação web (PWA) para registrar ocorrências, acompanhar histórico, visualizar fornos críticos, gerar rankings e aplicar análise de Pareto.</w:t>
       </w:r>
     </w:p>
     <w:p>
@@ -861,68 +705,12 @@
           <w:color w:val="333333"/>
           <w:sz w:val="22"/>
         </w:rPr>
-        <w:t>Integração com Power Automate e Excel Online, permitindo armazenamento dos registros, automações e apoio à geração de relatórios.</w:t>
+        <w:t>Integração com Power Automate e Excel Online, deploy via GitHub/Cloudflare e desenvolvimento assistido por IA (Claude, Copilot e ChatGPT).</w:t>
       </w:r>
     </w:p>
     <w:p>
       <w:pPr>
-        <w:spacing w:lineRule="auto" w:line="276" w:before="0" w:after="20"/>
-        <w:ind w:left="283" w:hanging="283"/>
-        <w:jc w:val="left"/>
-      </w:pPr>
-      <w:r>
-        <w:rPr>
-          <w:rFonts w:ascii="Arial" w:hAnsi="Arial" w:cs="Arial"/>
-          <w:b w:val="0"/>
-          <w:i w:val="0"/>
-          <w:color w:val="333333"/>
-          <w:sz w:val="22"/>
-        </w:rPr>
-        <w:t>•</w:t>
-        <w:tab/>
-      </w:r>
-      <w:r>
-        <w:rPr>
-          <w:rFonts w:ascii="Arial" w:hAnsi="Arial" w:cs="Arial"/>
-          <w:b w:val="0"/>
-          <w:i w:val="0"/>
-          <w:color w:val="333333"/>
-          <w:sz w:val="22"/>
-        </w:rPr>
-        <w:t>Deploy e testes utilizando GitHub e Cloudflare, com foco em acesso simples, visualização prática e uso em ambiente operacional.</w:t>
-      </w:r>
-    </w:p>
-    <w:p>
-      <w:pPr>
-        <w:spacing w:lineRule="auto" w:line="276" w:before="0" w:after="20"/>
-        <w:ind w:left="283" w:hanging="283"/>
-        <w:jc w:val="left"/>
-      </w:pPr>
-      <w:r>
-        <w:rPr>
-          <w:rFonts w:ascii="Arial" w:hAnsi="Arial" w:cs="Arial"/>
-          <w:b w:val="0"/>
-          <w:i w:val="0"/>
-          <w:color w:val="333333"/>
-          <w:sz w:val="22"/>
-        </w:rPr>
-        <w:t>•</w:t>
-        <w:tab/>
-      </w:r>
-      <w:r>
-        <w:rPr>
-          <w:rFonts w:ascii="Arial" w:hAnsi="Arial" w:cs="Arial"/>
-          <w:b w:val="0"/>
-          <w:i w:val="0"/>
-          <w:color w:val="333333"/>
-          <w:sz w:val="22"/>
-        </w:rPr>
-        <w:t>Uso de desenvolvimento assistido por IA, com apoio de ferramentas como Claude, Copilot e ChatGPT para estruturar telas, revisar lógica, melhorar código e acelerar prototipagem.</w:t>
-      </w:r>
-    </w:p>
-    <w:p>
-      <w:pPr>
-        <w:spacing w:lineRule="auto" w:line="276" w:before="0" w:after="60"/>
+        <w:spacing w:lineRule="auto" w:line="276" w:before="0" w:after="80"/>
         <w:ind w:left="283" w:hanging="283"/>
         <w:jc w:val="left"/>
       </w:pPr>
@@ -955,7 +743,7 @@
           <w:color w:val="333333"/>
           <w:sz w:val="22"/>
         </w:rPr>
-        <w:t>substituição de controles soltos por um modelo digital mais rastreável, visual e organizado, facilitando a priorização de problemas e o acompanhamento de ocorrências.</w:t>
+        <w:t>substituição de controles soltos por um modelo digital rastreável e visual, testado em piloto, facilitando a priorização de problemas.</w:t>
       </w:r>
     </w:p>
     <w:p>
@@ -972,62 +760,6 @@
           <w:sz w:val="22"/>
         </w:rPr>
         <w:t>Sistema de Gestão de Estoque LIS — Projeto Acadêmico SENAI</w:t>
-      </w:r>
-    </w:p>
-    <w:p>
-      <w:pPr>
-        <w:spacing w:lineRule="auto" w:line="276" w:before="0" w:after="20"/>
-        <w:ind w:left="283" w:hanging="283"/>
-        <w:jc w:val="left"/>
-      </w:pPr>
-      <w:r>
-        <w:rPr>
-          <w:rFonts w:ascii="Arial" w:hAnsi="Arial" w:cs="Arial"/>
-          <w:b w:val="0"/>
-          <w:i w:val="0"/>
-          <w:color w:val="333333"/>
-          <w:sz w:val="22"/>
-        </w:rPr>
-        <w:t>•</w:t>
-        <w:tab/>
-      </w:r>
-      <w:r>
-        <w:rPr>
-          <w:rFonts w:ascii="Arial" w:hAnsi="Arial" w:cs="Arial"/>
-          <w:b w:val="0"/>
-          <w:i w:val="0"/>
-          <w:color w:val="333333"/>
-          <w:sz w:val="22"/>
-        </w:rPr>
-        <w:t>Desenvolvimento de site em HTML, JavaScript e GitHub Pages, integrado ao Excel Online via Power Automate.</w:t>
-      </w:r>
-    </w:p>
-    <w:p>
-      <w:pPr>
-        <w:spacing w:lineRule="auto" w:line="276" w:before="0" w:after="20"/>
-        <w:ind w:left="283" w:hanging="283"/>
-        <w:jc w:val="left"/>
-      </w:pPr>
-      <w:r>
-        <w:rPr>
-          <w:rFonts w:ascii="Arial" w:hAnsi="Arial" w:cs="Arial"/>
-          <w:b w:val="0"/>
-          <w:i w:val="0"/>
-          <w:color w:val="333333"/>
-          <w:sz w:val="22"/>
-        </w:rPr>
-        <w:t>•</w:t>
-        <w:tab/>
-      </w:r>
-      <w:r>
-        <w:rPr>
-          <w:rFonts w:ascii="Arial" w:hAnsi="Arial" w:cs="Arial"/>
-          <w:b w:val="0"/>
-          <w:i w:val="0"/>
-          <w:color w:val="333333"/>
-          <w:sz w:val="22"/>
-        </w:rPr>
-        <w:t>Criação de controles de entrada e saída, curva ABC, estoque de segurança, ponto de pedido e dashboards automáticos.</w:t>
       </w:r>
     </w:p>
     <w:p>
@@ -1055,13 +787,13 @@
           <w:color w:val="333333"/>
           <w:sz w:val="22"/>
         </w:rPr>
-        <w:t>Projeto voltado à melhoria da rastreabilidade, redução de controles manuais e apoio à tomada de decisão em rotinas de estoque.</w:t>
+        <w:t>Site em HTML/JavaScript (GitHub Pages) integrado ao Excel Online via Power Automate: curva ABC, estoque de segurança, ponto de pedido e dashboards em tempo real.</w:t>
       </w:r>
     </w:p>
     <w:p>
       <w:pPr>
         <w:keepNext/>
-        <w:spacing w:lineRule="auto" w:line="276" w:before="140" w:after="60"/>
+        <w:spacing w:lineRule="auto" w:line="276" w:before="140" w:after="80"/>
         <w:jc w:val="left"/>
         <w:pBdr>
           <w:bottom w:val="single" w:sz="6" w:space="2" w:color="1B365D"/>
@@ -1080,7 +812,7 @@
     </w:p>
     <w:p>
       <w:pPr>
-        <w:spacing w:lineRule="auto" w:line="276" w:before="40" w:after="20"/>
+        <w:spacing w:lineRule="auto" w:line="276" w:before="20" w:after="40"/>
         <w:jc w:val="left"/>
       </w:pPr>
       <w:r>
@@ -1101,28 +833,12 @@
           <w:color w:val="333333"/>
           <w:sz w:val="22"/>
         </w:rPr>
-        <w:t xml:space="preserve">  |  Sorocaba/SP</w:t>
+        <w:t xml:space="preserve">  |  início em agosto/2026</w:t>
       </w:r>
     </w:p>
     <w:p>
       <w:pPr>
-        <w:spacing w:lineRule="auto" w:line="276" w:before="0" w:after="60"/>
-        <w:jc w:val="left"/>
-      </w:pPr>
-      <w:r>
-        <w:rPr>
-          <w:rFonts w:ascii="Arial" w:hAnsi="Arial" w:cs="Arial"/>
-          <w:b w:val="0"/>
-          <w:i w:val="0"/>
-          <w:color w:val="333333"/>
-          <w:sz w:val="22"/>
-        </w:rPr>
-        <w:t>Aprovado — início em agosto/2026</w:t>
-      </w:r>
-    </w:p>
-    <w:p>
-      <w:pPr>
-        <w:spacing w:lineRule="auto" w:line="276" w:before="0" w:after="20"/>
+        <w:spacing w:lineRule="auto" w:line="276" w:before="0" w:after="40"/>
         <w:jc w:val="left"/>
       </w:pPr>
       <w:r>
@@ -1135,12 +851,6 @@
         </w:rPr>
         <w:t>Técnico em Administração — SENAI</w:t>
       </w:r>
-    </w:p>
-    <w:p>
-      <w:pPr>
-        <w:spacing w:lineRule="auto" w:line="276" w:before="0" w:after="60"/>
-        <w:jc w:val="left"/>
-      </w:pPr>
       <w:r>
         <w:rPr>
           <w:rFonts w:ascii="Arial" w:hAnsi="Arial" w:cs="Arial"/>
@@ -1149,12 +859,12 @@
           <w:color w:val="333333"/>
           <w:sz w:val="22"/>
         </w:rPr>
-        <w:t>Carga horária: 1.200h  |  Conclusão: junho/2026</w:t>
+        <w:t xml:space="preserve">  |  1.200h — conclusão: junho/2026</w:t>
       </w:r>
     </w:p>
     <w:p>
       <w:pPr>
-        <w:spacing w:lineRule="auto" w:line="276" w:before="0" w:after="20"/>
+        <w:spacing w:lineRule="auto" w:line="276" w:before="0" w:after="60"/>
         <w:jc w:val="left"/>
       </w:pPr>
       <w:r>
@@ -1167,12 +877,6 @@
         </w:rPr>
         <w:t>Técnico em Eletromecânica — SENAI Mairinque</w:t>
       </w:r>
-    </w:p>
-    <w:p>
-      <w:pPr>
-        <w:spacing w:lineRule="auto" w:line="276" w:before="0" w:after="60"/>
-        <w:jc w:val="left"/>
-      </w:pPr>
       <w:r>
         <w:rPr>
           <w:rFonts w:ascii="Arial" w:hAnsi="Arial" w:cs="Arial"/>
@@ -1181,13 +885,13 @@
           <w:color w:val="333333"/>
           <w:sz w:val="22"/>
         </w:rPr>
-        <w:t>Carga horária: 1.500h  |  Conclusão: junho/2025</w:t>
+        <w:t xml:space="preserve">  |  1.500h — conclusão: junho/2025</w:t>
       </w:r>
     </w:p>
     <w:p>
       <w:pPr>
         <w:keepNext/>
-        <w:spacing w:lineRule="auto" w:line="276" w:before="140" w:after="60"/>
+        <w:spacing w:lineRule="auto" w:line="276" w:before="140" w:after="80"/>
         <w:jc w:val="left"/>
         <w:pBdr>
           <w:bottom w:val="single" w:sz="6" w:space="2" w:color="1B365D"/>
@@ -1229,7 +933,7 @@
           <w:color w:val="333333"/>
           <w:sz w:val="22"/>
         </w:rPr>
-        <w:t>Excel Avançado — SENAI | 40h</w:t>
+        <w:t>NR-11 — Operação de Empilhadeira — SENAI (32h, 2023); reciclagens — SuperFrio (2024)</w:t>
       </w:r>
     </w:p>
     <w:p>
@@ -1257,7 +961,7 @@
           <w:color w:val="333333"/>
           <w:sz w:val="22"/>
         </w:rPr>
-        <w:t>Power BI — SENAI | 32h</w:t>
+        <w:t>Metrologia Aplicada à Mecânica (60h) e PCP (40h) — SENAI (2024)</w:t>
       </w:r>
     </w:p>
     <w:p>
@@ -1285,7 +989,7 @@
           <w:color w:val="333333"/>
           <w:sz w:val="22"/>
         </w:rPr>
-        <w:t>Fundamentos do Python — SENAI | 30h</w:t>
+        <w:t>Caldeiraria Prática — AHCX Treinamentos / MJS Brasil (jan–jul/2026, em conclusão)</w:t>
       </w:r>
     </w:p>
     <w:p>
@@ -1313,231 +1017,7 @@
           <w:color w:val="333333"/>
           <w:sz w:val="22"/>
         </w:rPr>
-        <w:t>PCP — Planejamento e Controle da Produção — SENAI | 40h</w:t>
-      </w:r>
-    </w:p>
-    <w:p>
-      <w:pPr>
-        <w:spacing w:lineRule="auto" w:line="276" w:before="0" w:after="20"/>
-        <w:ind w:left="283" w:hanging="283"/>
-        <w:jc w:val="left"/>
-      </w:pPr>
-      <w:r>
-        <w:rPr>
-          <w:rFonts w:ascii="Arial" w:hAnsi="Arial" w:cs="Arial"/>
-          <w:b w:val="0"/>
-          <w:i w:val="0"/>
-          <w:color w:val="333333"/>
-          <w:sz w:val="22"/>
-        </w:rPr>
-        <w:t>•</w:t>
-        <w:tab/>
-      </w:r>
-      <w:r>
-        <w:rPr>
-          <w:rFonts w:ascii="Arial" w:hAnsi="Arial" w:cs="Arial"/>
-          <w:b w:val="0"/>
-          <w:i w:val="0"/>
-          <w:color w:val="333333"/>
-          <w:sz w:val="22"/>
-        </w:rPr>
-        <w:t>Metrologia Aplicada à Mecânica — SENAI | 60h</w:t>
-      </w:r>
-    </w:p>
-    <w:p>
-      <w:pPr>
-        <w:spacing w:lineRule="auto" w:line="276" w:before="0" w:after="20"/>
-        <w:ind w:left="283" w:hanging="283"/>
-        <w:jc w:val="left"/>
-      </w:pPr>
-      <w:r>
-        <w:rPr>
-          <w:rFonts w:ascii="Arial" w:hAnsi="Arial" w:cs="Arial"/>
-          <w:b w:val="0"/>
-          <w:i w:val="0"/>
-          <w:color w:val="333333"/>
-          <w:sz w:val="22"/>
-        </w:rPr>
-        <w:t>•</w:t>
-        <w:tab/>
-      </w:r>
-      <w:r>
-        <w:rPr>
-          <w:rFonts w:ascii="Arial" w:hAnsi="Arial" w:cs="Arial"/>
-          <w:b w:val="0"/>
-          <w:i w:val="0"/>
-          <w:color w:val="333333"/>
-          <w:sz w:val="22"/>
-        </w:rPr>
-        <w:t>Lógica de Programação — SENAI | 14h</w:t>
-      </w:r>
-    </w:p>
-    <w:p>
-      <w:pPr>
-        <w:spacing w:lineRule="auto" w:line="276" w:before="0" w:after="20"/>
-        <w:ind w:left="283" w:hanging="283"/>
-        <w:jc w:val="left"/>
-      </w:pPr>
-      <w:r>
-        <w:rPr>
-          <w:rFonts w:ascii="Arial" w:hAnsi="Arial" w:cs="Arial"/>
-          <w:b w:val="0"/>
-          <w:i w:val="0"/>
-          <w:color w:val="333333"/>
-          <w:sz w:val="22"/>
-        </w:rPr>
-        <w:t>•</w:t>
-        <w:tab/>
-      </w:r>
-      <w:r>
-        <w:rPr>
-          <w:rFonts w:ascii="Arial" w:hAnsi="Arial" w:cs="Arial"/>
-          <w:b w:val="0"/>
-          <w:i w:val="0"/>
-          <w:color w:val="333333"/>
-          <w:sz w:val="22"/>
-        </w:rPr>
-        <w:t>Segurança Cibernética — SENAI | 4h</w:t>
-      </w:r>
-    </w:p>
-    <w:p>
-      <w:pPr>
-        <w:spacing w:lineRule="auto" w:line="276" w:before="0" w:after="20"/>
-        <w:ind w:left="283" w:hanging="283"/>
-        <w:jc w:val="left"/>
-      </w:pPr>
-      <w:r>
-        <w:rPr>
-          <w:rFonts w:ascii="Arial" w:hAnsi="Arial" w:cs="Arial"/>
-          <w:b w:val="0"/>
-          <w:i w:val="0"/>
-          <w:color w:val="333333"/>
-          <w:sz w:val="22"/>
-        </w:rPr>
-        <w:t>•</w:t>
-        <w:tab/>
-      </w:r>
-      <w:r>
-        <w:rPr>
-          <w:rFonts w:ascii="Arial" w:hAnsi="Arial" w:cs="Arial"/>
-          <w:b w:val="0"/>
-          <w:i w:val="0"/>
-          <w:color w:val="333333"/>
-          <w:sz w:val="22"/>
-        </w:rPr>
-        <w:t>Desvendando a Indústria 4.0 — SENAI | 20h</w:t>
-      </w:r>
-    </w:p>
-    <w:p>
-      <w:pPr>
-        <w:spacing w:lineRule="auto" w:line="276" w:before="0" w:after="20"/>
-        <w:ind w:left="283" w:hanging="283"/>
-        <w:jc w:val="left"/>
-      </w:pPr>
-      <w:r>
-        <w:rPr>
-          <w:rFonts w:ascii="Arial" w:hAnsi="Arial" w:cs="Arial"/>
-          <w:b w:val="0"/>
-          <w:i w:val="0"/>
-          <w:color w:val="333333"/>
-          <w:sz w:val="22"/>
-        </w:rPr>
-        <w:t>•</w:t>
-        <w:tab/>
-      </w:r>
-      <w:r>
-        <w:rPr>
-          <w:rFonts w:ascii="Arial" w:hAnsi="Arial" w:cs="Arial"/>
-          <w:b w:val="0"/>
-          <w:i w:val="0"/>
-          <w:color w:val="333333"/>
-          <w:sz w:val="22"/>
-        </w:rPr>
-        <w:t>Fundamentos da Inteligência Artificial — SENAI | 8h</w:t>
-      </w:r>
-    </w:p>
-    <w:p>
-      <w:pPr>
-        <w:spacing w:lineRule="auto" w:line="276" w:before="0" w:after="20"/>
-        <w:ind w:left="283" w:hanging="283"/>
-        <w:jc w:val="left"/>
-      </w:pPr>
-      <w:r>
-        <w:rPr>
-          <w:rFonts w:ascii="Arial" w:hAnsi="Arial" w:cs="Arial"/>
-          <w:b w:val="0"/>
-          <w:i w:val="0"/>
-          <w:color w:val="333333"/>
-          <w:sz w:val="22"/>
-        </w:rPr>
-        <w:t>•</w:t>
-        <w:tab/>
-      </w:r>
-      <w:r>
-        <w:rPr>
-          <w:rFonts w:ascii="Arial" w:hAnsi="Arial" w:cs="Arial"/>
-          <w:b w:val="0"/>
-          <w:i w:val="0"/>
-          <w:color w:val="333333"/>
-          <w:sz w:val="22"/>
-        </w:rPr>
-        <w:t>Ética na Inteligência Artificial — SENAI | 4h</w:t>
-      </w:r>
-    </w:p>
-    <w:p>
-      <w:pPr>
-        <w:spacing w:lineRule="auto" w:line="276" w:before="0" w:after="20"/>
-        <w:ind w:left="283" w:hanging="283"/>
-        <w:jc w:val="left"/>
-      </w:pPr>
-      <w:r>
-        <w:rPr>
-          <w:rFonts w:ascii="Arial" w:hAnsi="Arial" w:cs="Arial"/>
-          <w:b w:val="0"/>
-          <w:i w:val="0"/>
-          <w:color w:val="333333"/>
-          <w:sz w:val="22"/>
-        </w:rPr>
-        <w:t>•</w:t>
-        <w:tab/>
-      </w:r>
-      <w:r>
-        <w:rPr>
-          <w:rFonts w:ascii="Arial" w:hAnsi="Arial" w:cs="Arial"/>
-          <w:b w:val="0"/>
-          <w:i w:val="0"/>
-          <w:color w:val="333333"/>
-          <w:sz w:val="22"/>
-        </w:rPr>
-        <w:t>NR-11 — Operação de Empilhadeira — SENAI | 32h</w:t>
-      </w:r>
-    </w:p>
-    <w:p>
-      <w:pPr>
-        <w:spacing w:lineRule="auto" w:line="276" w:before="0" w:after="20"/>
-        <w:ind w:left="283" w:hanging="283"/>
-        <w:jc w:val="left"/>
-      </w:pPr>
-      <w:r>
-        <w:rPr>
-          <w:rFonts w:ascii="Arial" w:hAnsi="Arial" w:cs="Arial"/>
-          <w:b w:val="0"/>
-          <w:i w:val="0"/>
-          <w:color w:val="333333"/>
-          <w:sz w:val="22"/>
-        </w:rPr>
-        <w:t>•</w:t>
-        <w:tab/>
-      </w:r>
-      <w:r>
-        <w:rPr>
-          <w:rFonts w:ascii="Arial" w:hAnsi="Arial" w:cs="Arial"/>
-          <w:b w:val="0"/>
-          <w:i w:val="0"/>
-          <w:color w:val="333333"/>
-          <w:sz w:val="22"/>
-        </w:rPr>
-        <w:t>Reciclagens NR-11 — SuperFrio</w:t>
+        <w:t>Excel Avançado (40h), Power BI (32h) e Fundamentos do Python (30h) — SENAI (2024)</w:t>
       </w:r>
     </w:p>
     <w:p>
@@ -1565,13 +1045,13 @@
           <w:color w:val="333333"/>
           <w:sz w:val="22"/>
         </w:rPr>
-        <w:t>Caldeiraria Prática — AHCX Treinamentos / MJS Brasil | jan/2026 – jul/2026</w:t>
+        <w:t>Lógica de Programação (14h), Segurança Cibernética (4h), Indústria 4.0 (20h), Fundamentos da IA (8h) e Ética na IA (4h) — SENAI (2025)</w:t>
       </w:r>
     </w:p>
     <w:p>
       <w:pPr>
         <w:keepNext/>
-        <w:spacing w:lineRule="auto" w:line="276" w:before="140" w:after="60"/>
+        <w:spacing w:lineRule="auto" w:line="276" w:before="140" w:after="80"/>
         <w:jc w:val="left"/>
         <w:pBdr>
           <w:bottom w:val="single" w:sz="6" w:space="2" w:color="1B365D"/>
@@ -1586,186 +1066,6 @@
           <w:sz w:val="28"/>
         </w:rPr>
         <w:t>COMPETÊNCIAS TÉCNICAS</w:t>
-      </w:r>
-    </w:p>
-    <w:p>
-      <w:pPr>
-        <w:spacing w:lineRule="auto" w:line="276" w:before="40" w:after="20"/>
-        <w:jc w:val="left"/>
-      </w:pPr>
-      <w:r>
-        <w:rPr>
-          <w:rFonts w:ascii="Arial" w:hAnsi="Arial" w:cs="Arial"/>
-          <w:b/>
-          <w:i w:val="0"/>
-          <w:color w:val="333333"/>
-          <w:sz w:val="22"/>
-        </w:rPr>
-        <w:t>Tecnologia, Dados e Automação:</w:t>
-      </w:r>
-    </w:p>
-    <w:p>
-      <w:pPr>
-        <w:spacing w:lineRule="auto" w:line="276" w:before="0" w:after="60"/>
-        <w:jc w:val="left"/>
-      </w:pPr>
-      <w:r>
-        <w:rPr>
-          <w:rFonts w:ascii="Arial" w:hAnsi="Arial" w:cs="Arial"/>
-          <w:b w:val="0"/>
-          <w:i w:val="0"/>
-          <w:color w:val="333333"/>
-          <w:sz w:val="22"/>
-        </w:rPr>
-        <w:t>Excel Avançado, Power BI, Power Automate, Power Apps, HTML, JavaScript, GitHub, GitHub Pages, Excel Online, Microsoft Forms, fundamentos de Python e desenvolvimento assistido por IA.</w:t>
-      </w:r>
-    </w:p>
-    <w:p>
-      <w:pPr>
-        <w:spacing w:lineRule="auto" w:line="276" w:before="0" w:after="20"/>
-        <w:jc w:val="left"/>
-      </w:pPr>
-      <w:r>
-        <w:rPr>
-          <w:rFonts w:ascii="Arial" w:hAnsi="Arial" w:cs="Arial"/>
-          <w:b/>
-          <w:i w:val="0"/>
-          <w:color w:val="333333"/>
-          <w:sz w:val="22"/>
-        </w:rPr>
-        <w:t>Sistemas Corporativos:</w:t>
-      </w:r>
-    </w:p>
-    <w:p>
-      <w:pPr>
-        <w:spacing w:lineRule="auto" w:line="276" w:before="0" w:after="60"/>
-        <w:jc w:val="left"/>
-      </w:pPr>
-      <w:r>
-        <w:rPr>
-          <w:rFonts w:ascii="Arial" w:hAnsi="Arial" w:cs="Arial"/>
-          <w:b w:val="0"/>
-          <w:i w:val="0"/>
-          <w:color w:val="333333"/>
-          <w:sz w:val="22"/>
-        </w:rPr>
-        <w:t>ServiceNow, Docnix, SAP, WMS Blue Yonder e ObraSoft.</w:t>
-      </w:r>
-    </w:p>
-    <w:p>
-      <w:pPr>
-        <w:spacing w:lineRule="auto" w:line="276" w:before="0" w:after="20"/>
-        <w:jc w:val="left"/>
-      </w:pPr>
-      <w:r>
-        <w:rPr>
-          <w:rFonts w:ascii="Arial" w:hAnsi="Arial" w:cs="Arial"/>
-          <w:b/>
-          <w:i w:val="0"/>
-          <w:color w:val="333333"/>
-          <w:sz w:val="22"/>
-        </w:rPr>
-        <w:t>Administração e Operações:</w:t>
-      </w:r>
-    </w:p>
-    <w:p>
-      <w:pPr>
-        <w:spacing w:lineRule="auto" w:line="276" w:before="0" w:after="60"/>
-        <w:jc w:val="left"/>
-      </w:pPr>
-      <w:r>
-        <w:rPr>
-          <w:rFonts w:ascii="Arial" w:hAnsi="Arial" w:cs="Arial"/>
-          <w:b w:val="0"/>
-          <w:i w:val="0"/>
-          <w:color w:val="333333"/>
-          <w:sz w:val="22"/>
-        </w:rPr>
-        <w:t>Governança documental, relatórios, indicadores, inventários, controle de materiais, gestão de EPIs, organização de almoxarifado, rotinas administrativas e suporte operacional.</w:t>
-      </w:r>
-    </w:p>
-    <w:p>
-      <w:pPr>
-        <w:spacing w:lineRule="auto" w:line="276" w:before="0" w:after="20"/>
-        <w:jc w:val="left"/>
-      </w:pPr>
-      <w:r>
-        <w:rPr>
-          <w:rFonts w:ascii="Arial" w:hAnsi="Arial" w:cs="Arial"/>
-          <w:b/>
-          <w:i w:val="0"/>
-          <w:color w:val="333333"/>
-          <w:sz w:val="22"/>
-        </w:rPr>
-        <w:t>Logística e Indústria:</w:t>
-      </w:r>
-    </w:p>
-    <w:p>
-      <w:pPr>
-        <w:spacing w:lineRule="auto" w:line="276" w:before="0" w:after="60"/>
-        <w:jc w:val="left"/>
-      </w:pPr>
-      <w:r>
-        <w:rPr>
-          <w:rFonts w:ascii="Arial" w:hAnsi="Arial" w:cs="Arial"/>
-          <w:b w:val="0"/>
-          <w:i w:val="0"/>
-          <w:color w:val="333333"/>
-          <w:sz w:val="22"/>
-        </w:rPr>
-        <w:t>Operação de empilhadeira, NR-11, expedição, armazenagem, picking, conferência, câmaras frias, PCP, metrologia, 5S, PDCA, Matriz GUT e gestão visual.</w:t>
-      </w:r>
-    </w:p>
-    <w:p>
-      <w:pPr>
-        <w:spacing w:lineRule="auto" w:line="276" w:before="0" w:after="20"/>
-        <w:jc w:val="left"/>
-      </w:pPr>
-      <w:r>
-        <w:rPr>
-          <w:rFonts w:ascii="Arial" w:hAnsi="Arial" w:cs="Arial"/>
-          <w:b/>
-          <w:i w:val="0"/>
-          <w:color w:val="333333"/>
-          <w:sz w:val="22"/>
-        </w:rPr>
-        <w:t>Competências Comportamentais:</w:t>
-      </w:r>
-    </w:p>
-    <w:p>
-      <w:pPr>
-        <w:spacing w:lineRule="auto" w:line="276" w:before="0" w:after="60"/>
-        <w:jc w:val="left"/>
-      </w:pPr>
-      <w:r>
-        <w:rPr>
-          <w:rFonts w:ascii="Arial" w:hAnsi="Arial" w:cs="Arial"/>
-          <w:b w:val="0"/>
-          <w:i w:val="0"/>
-          <w:color w:val="333333"/>
-          <w:sz w:val="22"/>
-        </w:rPr>
-        <w:t>Disciplina, responsabilidade, foco em resolução de problemas, aprendizado rápido, proatividade, resiliência, organização e mentalidade de melhoria contínua.</w:t>
-      </w:r>
-    </w:p>
-    <w:p>
-      <w:pPr>
-        <w:keepNext/>
-        <w:spacing w:lineRule="auto" w:line="276" w:before="140" w:after="60"/>
-        <w:jc w:val="left"/>
-        <w:pBdr>
-          <w:bottom w:val="single" w:sz="6" w:space="2" w:color="1B365D"/>
-        </w:pBdr>
-      </w:pPr>
-      <w:r>
-        <w:rPr>
-          <w:rFonts w:ascii="Arial" w:hAnsi="Arial" w:cs="Arial"/>
-          <w:b/>
-          <w:i w:val="0"/>
-          <w:color w:val="1B365D"/>
-          <w:sz w:val="28"/>
-        </w:rPr>
-        <w:t>INFORMAÇÕES ADICIONAIS</w:t>
       </w:r>
     </w:p>
     <w:p>
@@ -1788,12 +1088,22 @@
       <w:r>
         <w:rPr>
           <w:rFonts w:ascii="Arial" w:hAnsi="Arial" w:cs="Arial"/>
+          <w:b/>
+          <w:i w:val="0"/>
+          <w:color w:val="333333"/>
+          <w:sz w:val="22"/>
+        </w:rPr>
+        <w:t xml:space="preserve">Tecnologia, Dados e Automação: </w:t>
+      </w:r>
+      <w:r>
+        <w:rPr>
+          <w:rFonts w:ascii="Arial" w:hAnsi="Arial" w:cs="Arial"/>
           <w:b w:val="0"/>
           <w:i w:val="0"/>
           <w:color w:val="333333"/>
           <w:sz w:val="22"/>
         </w:rPr>
-        <w:t>CNH categorias A e B, com EAR.</w:t>
+        <w:t>Excel Avançado, Power BI, Power Automate, Power Apps, HTML, JavaScript, GitHub, fundamentos de Python e desenvolvimento assistido por IA.</w:t>
       </w:r>
     </w:p>
     <w:p>
@@ -1816,12 +1126,22 @@
       <w:r>
         <w:rPr>
           <w:rFonts w:ascii="Arial" w:hAnsi="Arial" w:cs="Arial"/>
+          <w:b/>
+          <w:i w:val="0"/>
+          <w:color w:val="333333"/>
+          <w:sz w:val="22"/>
+        </w:rPr>
+        <w:t xml:space="preserve">Sistemas Corporativos: </w:t>
+      </w:r>
+      <w:r>
+        <w:rPr>
+          <w:rFonts w:ascii="Arial" w:hAnsi="Arial" w:cs="Arial"/>
           <w:b w:val="0"/>
           <w:i w:val="0"/>
           <w:color w:val="333333"/>
           <w:sz w:val="22"/>
         </w:rPr>
-        <w:t>Disponibilidade para início imediato.</w:t>
+        <w:t>ServiceNow, Docnix, SAP, WMS Blue Yonder e ObraSoft.</w:t>
       </w:r>
     </w:p>
     <w:p>
@@ -1844,12 +1164,118 @@
       <w:r>
         <w:rPr>
           <w:rFonts w:ascii="Arial" w:hAnsi="Arial" w:cs="Arial"/>
+          <w:b/>
+          <w:i w:val="0"/>
+          <w:color w:val="333333"/>
+          <w:sz w:val="22"/>
+        </w:rPr>
+        <w:t xml:space="preserve">Administração e Operações: </w:t>
+      </w:r>
+      <w:r>
+        <w:rPr>
+          <w:rFonts w:ascii="Arial" w:hAnsi="Arial" w:cs="Arial"/>
           <w:b w:val="0"/>
           <w:i w:val="0"/>
           <w:color w:val="333333"/>
           <w:sz w:val="22"/>
         </w:rPr>
-        <w:t>Disponibilidade para turnos ou horário comercial.</w:t>
+        <w:t>governança documental, relatórios, indicadores, inventários, controle de materiais, gestão de EPIs e organização de almoxarifado.</w:t>
+      </w:r>
+    </w:p>
+    <w:p>
+      <w:pPr>
+        <w:spacing w:lineRule="auto" w:line="276" w:before="0" w:after="20"/>
+        <w:ind w:left="283" w:hanging="283"/>
+        <w:jc w:val="left"/>
+      </w:pPr>
+      <w:r>
+        <w:rPr>
+          <w:rFonts w:ascii="Arial" w:hAnsi="Arial" w:cs="Arial"/>
+          <w:b w:val="0"/>
+          <w:i w:val="0"/>
+          <w:color w:val="333333"/>
+          <w:sz w:val="22"/>
+        </w:rPr>
+        <w:t>•</w:t>
+        <w:tab/>
+      </w:r>
+      <w:r>
+        <w:rPr>
+          <w:rFonts w:ascii="Arial" w:hAnsi="Arial" w:cs="Arial"/>
+          <w:b/>
+          <w:i w:val="0"/>
+          <w:color w:val="333333"/>
+          <w:sz w:val="22"/>
+        </w:rPr>
+        <w:t xml:space="preserve">Logística e Indústria: </w:t>
+      </w:r>
+      <w:r>
+        <w:rPr>
+          <w:rFonts w:ascii="Arial" w:hAnsi="Arial" w:cs="Arial"/>
+          <w:b w:val="0"/>
+          <w:i w:val="0"/>
+          <w:color w:val="333333"/>
+          <w:sz w:val="22"/>
+        </w:rPr>
+        <w:t>operação de empilhadeira (NR-11), expedição, armazenagem, picking, câmaras frias, PCP, metrologia, 5S, PDCA, Matriz GUT e gestão visual.</w:t>
+      </w:r>
+    </w:p>
+    <w:p>
+      <w:pPr>
+        <w:spacing w:lineRule="auto" w:line="276" w:before="0" w:after="60"/>
+        <w:ind w:left="283" w:hanging="283"/>
+        <w:jc w:val="left"/>
+      </w:pPr>
+      <w:r>
+        <w:rPr>
+          <w:rFonts w:ascii="Arial" w:hAnsi="Arial" w:cs="Arial"/>
+          <w:b w:val="0"/>
+          <w:i w:val="0"/>
+          <w:color w:val="333333"/>
+          <w:sz w:val="22"/>
+        </w:rPr>
+        <w:t>•</w:t>
+        <w:tab/>
+      </w:r>
+      <w:r>
+        <w:rPr>
+          <w:rFonts w:ascii="Arial" w:hAnsi="Arial" w:cs="Arial"/>
+          <w:b/>
+          <w:i w:val="0"/>
+          <w:color w:val="333333"/>
+          <w:sz w:val="22"/>
+        </w:rPr>
+        <w:t xml:space="preserve">Comportamentais: </w:t>
+      </w:r>
+      <w:r>
+        <w:rPr>
+          <w:rFonts w:ascii="Arial" w:hAnsi="Arial" w:cs="Arial"/>
+          <w:b w:val="0"/>
+          <w:i w:val="0"/>
+          <w:color w:val="333333"/>
+          <w:sz w:val="22"/>
+        </w:rPr>
+        <w:t>disciplina, responsabilidade, proatividade, aprendizado rápido, resiliência e mentalidade de melhoria contínua.</w:t>
+      </w:r>
+    </w:p>
+    <w:p>
+      <w:pPr>
+        <w:keepNext/>
+        <w:spacing w:lineRule="auto" w:line="276" w:before="140" w:after="80"/>
+        <w:jc w:val="left"/>
+        <w:pBdr>
+          <w:bottom w:val="single" w:sz="6" w:space="2" w:color="1B365D"/>
+        </w:pBdr>
+      </w:pPr>
+      <w:r>
+        <w:rPr>
+          <w:rFonts w:ascii="Arial" w:hAnsi="Arial" w:cs="Arial"/>
+          <w:b/>
+          <w:i w:val="0"/>
+          <w:color w:val="1B365D"/>
+          <w:sz w:val="28"/>
+        </w:rPr>
+        <w:t>INFORMAÇÕES ADICIONAIS</w:t>
       </w:r>
     </w:p>
     <w:p>
@@ -1877,7 +1303,7 @@
           <w:color w:val="333333"/>
           <w:sz w:val="22"/>
         </w:rPr>
-        <w:t>Interesse em oportunidades nas áreas de suporte de TI, administração, BI, logística, operações, manutenção, melhoria de processos e tecnologia.</w:t>
+        <w:t>CNH categorias A e B (EAR); disponibilidade para início imediato, em turnos ou horário comercial; interesse em suporte de TI, administração, BI, logística, operações e melhoria de processos.</w:t>
       </w:r>
     </w:p>
     <w:sectPr>

</xml_diff>